<commit_message>
Deutsch 11: Technik-Training in Einzelarbeit statt Gruppenpuzzle, Exit-Ticket als Mini-Test
Co-Authored-By: Claude Opus 5.5 <noreply@anthropic.com>
Claude-Session: https://claude.ai/code/session_01Kzh1oWiqhC6W8oSNq8mKnj
</commit_message>
<xml_diff>
--- a/Deutsch_11/Kommunikationsstoerungen_loesen/Lehrermaterial_und_Loesungen.docx
+++ b/Deutsch_11/Kommunikationsstoerungen_loesen/Lehrermaterial_und_Loesungen.docx
@@ -137,7 +137,7 @@
                 <w:sz w:val="19"/>
                 <w:szCs w:val="19"/>
               </w:rPr>
-              <w:t xml:space="preserve">•  kennen vier Strategien zur Konfliktlösung (Ich-Botschaft, Empathie, Wunsch/Bitte, Metakommunikation) und wenden sie an,</w:t>
+              <w:t xml:space="preserve">•  wenden vier Techniken (Ich-Botschaft, Empathie, Wunsch/Bitte, Metakommunikation) einzeln an, indem sie Kipppunkte umschreiben,</w:t>
             </w:r>
           </w:p>
           <w:p>
@@ -176,7 +176,7 @@
                 <w:sz w:val="19"/>
                 <w:szCs w:val="19"/>
               </w:rPr>
-              <w:t xml:space="preserve">21 Schülerinnen und Schüler · Impuls einzeln, dann zu zweit · danach drei Gruppen à 7: Wandreihe, Mittelreihe, Fensterreihe.</w:t>
+              <w:t xml:space="preserve">21 Schülerinnen und Schüler · bis Minute 43 in den Reihen (einzeln / zu zweit) · danach drei Gruppen à 7: Wandreihe, Mittelreihe, Fensterreihe.</w:t>
             </w:r>
           </w:p>
         </w:tc>
@@ -351,7 +351,7 @@
                 <w:sz w:val="19"/>
                 <w:szCs w:val="19"/>
               </w:rPr>
-              <w:t xml:space="preserve">Kartenset S. 1–2: Expertenkarten A–D</w:t>
+              <w:t xml:space="preserve">Kartenset S. 1: Rollen- und Tippkarten</w:t>
             </w:r>
           </w:p>
         </w:tc>
@@ -383,7 +383,7 @@
                 <w:sz w:val="19"/>
                 <w:szCs w:val="19"/>
               </w:rPr>
-              <w:t xml:space="preserve">6 Sätze (2 pro Gruppe; B–D werden im Tandem gelesen)</w:t>
+              <w:t xml:space="preserve">Rollen: 3 Sätze · Tipps: 2–3 Sätze fürs Pult</w:t>
             </w:r>
           </w:p>
         </w:tc>
@@ -432,7 +432,7 @@
                 <w:sz w:val="19"/>
                 <w:szCs w:val="19"/>
               </w:rPr>
-              <w:t xml:space="preserve">Kartenset S. 3: Rollen- und Tippkarten</w:t>
+              <w:t xml:space="preserve">Kartenset S. 2: Notfall-Ideen</w:t>
             </w:r>
           </w:p>
         </w:tc>
@@ -464,7 +464,7 @@
                 <w:sz w:val="19"/>
                 <w:szCs w:val="19"/>
               </w:rPr>
-              <w:t xml:space="preserve">Rollen: 3 Sätze · Tipps: 2–3 Sätze fürs Pult</w:t>
+              <w:t xml:space="preserve">1 Satz, in einen Umschlag – bleibt bei Ihnen</w:t>
             </w:r>
           </w:p>
         </w:tc>
@@ -513,7 +513,7 @@
                 <w:sz w:val="19"/>
                 <w:szCs w:val="19"/>
               </w:rPr>
-              <w:t xml:space="preserve">Kartenset S. 4: Notfall-Ideen</w:t>
+              <w:t xml:space="preserve">Kartenset S. 3: Moderationskarte</w:t>
             </w:r>
           </w:p>
         </w:tc>
@@ -545,7 +545,7 @@
                 <w:sz w:val="19"/>
                 <w:szCs w:val="19"/>
               </w:rPr>
-              <w:t xml:space="preserve">1 Satz, in einen Umschlag – bleibt bei Ihnen</w:t>
+              <w:t xml:space="preserve">2× (Moderation + Sie)</w:t>
             </w:r>
           </w:p>
         </w:tc>
@@ -594,7 +594,7 @@
                 <w:sz w:val="19"/>
                 <w:szCs w:val="19"/>
               </w:rPr>
-              <w:t xml:space="preserve">Kartenset S. 5: Moderationskarte</w:t>
+              <w:t xml:space="preserve">Kartenset S. 4: Exit-Tickets (Mini-Test)</w:t>
             </w:r>
           </w:p>
         </w:tc>
@@ -626,7 +626,7 @@
                 <w:sz w:val="19"/>
                 <w:szCs w:val="19"/>
               </w:rPr>
-              <w:t xml:space="preserve">2× (Moderation + Sie)</w:t>
+              <w:t xml:space="preserve">11× (2 pro Seite), je 7 in die Gruppenumschläge</w:t>
             </w:r>
           </w:p>
         </w:tc>
@@ -675,7 +675,7 @@
                 <w:sz w:val="19"/>
                 <w:szCs w:val="19"/>
               </w:rPr>
-              <w:t xml:space="preserve">Kartenset S. 6: Exit-Tickets</w:t>
+              <w:t xml:space="preserve">Erwartungshorizonte (S. 3–4 dieses Dokuments)</w:t>
             </w:r>
           </w:p>
         </w:tc>
@@ -707,88 +707,7 @@
                 <w:sz w:val="19"/>
                 <w:szCs w:val="19"/>
               </w:rPr>
-              <w:t xml:space="preserve">21× (6 Seiten), je 7 in die Gruppenumschläge</w:t>
-            </w:r>
-          </w:p>
-        </w:tc>
-      </w:tr>
-      <w:tr>
-        <w:trPr>
-          <w:cantSplit/>
-          <w:trHeight w:val="340" w:hRule="atLeast"/>
-        </w:trPr>
-        <w:tc>
-          <w:tcPr>
-            <w:tcW w:type="dxa" w:w="5000"/>
-            <w:tcBorders>
-              <w:top w:val="single" w:color="B9C6E8" w:sz="6"/>
-              <w:left w:val="single" w:color="B9C6E8" w:sz="6"/>
-              <w:bottom w:val="single" w:color="B9C6E8" w:sz="6"/>
-              <w:right w:val="single" w:color="B9C6E8" w:sz="6"/>
-            </w:tcBorders>
-            <w:tcMar>
-              <w:top w:type="dxa" w:w="60"/>
-              <w:left w:type="dxa" w:w="100"/>
-              <w:bottom w:type="dxa" w:w="60"/>
-              <w:right w:type="dxa" w:w="100"/>
-            </w:tcMar>
-            <w:vAlign w:val="center"/>
-          </w:tcPr>
-          <w:p>
-            <w:pPr>
-              <w:spacing w:after="0" w:before="0"/>
-            </w:pPr>
-            <w:r>
-              <w:rPr>
-                <w:rFonts w:ascii="Calibri" w:cs="Calibri" w:eastAsia="Calibri" w:hAnsi="Calibri"/>
-                <w:color w:val="000000"/>
-                <w:sz w:val="20"/>
-                <w:szCs w:val="20"/>
-              </w:rPr>
-              <w:t xml:space="preserve">☐  </w:t>
-            </w:r>
-            <w:r>
-              <w:rPr>
-                <w:rFonts w:ascii="Calibri" w:cs="Calibri" w:eastAsia="Calibri" w:hAnsi="Calibri"/>
-                <w:b/>
-                <w:bCs/>
-                <w:color w:val="000000"/>
-                <w:sz w:val="19"/>
-                <w:szCs w:val="19"/>
-              </w:rPr>
-              <w:t xml:space="preserve">Erwartungshorizonte (S. 3–4 dieses Dokuments)</w:t>
-            </w:r>
-          </w:p>
-        </w:tc>
-        <w:tc>
-          <w:tcPr>
-            <w:tcW w:type="dxa" w:w="5206"/>
-            <w:tcBorders>
-              <w:top w:val="single" w:color="B9C6E8" w:sz="6"/>
-              <w:left w:val="single" w:color="B9C6E8" w:sz="6"/>
-              <w:bottom w:val="single" w:color="B9C6E8" w:sz="6"/>
-              <w:right w:val="single" w:color="B9C6E8" w:sz="6"/>
-            </w:tcBorders>
-            <w:tcMar>
-              <w:top w:type="dxa" w:w="60"/>
-              <w:left w:type="dxa" w:w="100"/>
-              <w:bottom w:type="dxa" w:w="60"/>
-              <w:right w:type="dxa" w:w="100"/>
-            </w:tcMar>
-            <w:vAlign w:val="center"/>
-          </w:tcPr>
-          <w:p>
-            <w:pPr>
-              <w:spacing w:after="0" w:before="0"/>
-            </w:pPr>
-            <w:r>
-              <w:rPr>
-                <w:rFonts w:ascii="Calibri" w:cs="Calibri" w:eastAsia="Calibri" w:hAnsi="Calibri"/>
-                <w:color w:val="000000"/>
-                <w:sz w:val="19"/>
-                <w:szCs w:val="19"/>
-              </w:rPr>
-              <w:t xml:space="preserve">1× für Sie (Grundlage für die beiden Unterrichtsgespräche)</w:t>
+              <w:t xml:space="preserve">1× für Sie (Unterrichtsgespräche + Mini-Test)</w:t>
             </w:r>
           </w:p>
         </w:tc>
@@ -997,7 +916,7 @@
                 <w:sz w:val="19"/>
                 <w:szCs w:val="19"/>
               </w:rPr>
-              <w:t xml:space="preserve">beschriftet „Wandreihe“, „Mittelreihe“, „Fensterreihe“. Inhalt: 4 Rollenkarten, 2 Sätze Expertenkarten A–D, 7 Exit-Tickets. Jeweils geschlossen auf den ersten Tisch der Reihe legen.</w:t>
+              <w:t xml:space="preserve">beschriftet „Wandreihe“, „Mittelreihe“, „Fensterreihe“. Inhalt: 4 Rollenkarten, 7 Exit-Tickets. Jeweils geschlossen auf den ersten Tisch der Reihe legen – geöffnet wird erst in Minute 43.</w:t>
             </w:r>
           </w:p>
         </w:tc>
@@ -1546,7 +1465,7 @@
           <w:sz w:val="19"/>
           <w:szCs w:val="19"/>
         </w:rPr>
-        <w:t xml:space="preserve"> sichern die Lösungen, im zweiten entsteht der Merkkasten. Tipp: Wer geantwortet hat, nimmt die nächste Person dran.</w:t>
+        <w:t xml:space="preserve"> sichern die Kipppunkte und die Techniken. Tipp: Wer geantwortet hat, nimmt die nächste Person dran.</w:t>
       </w:r>
     </w:p>
     <w:p>
@@ -1955,7 +1874,7 @@
                 <w:sz w:val="18"/>
                 <w:szCs w:val="18"/>
               </w:rPr>
-              <w:t xml:space="preserve">setzt sich wie gewohnt in die Reihen, findet M1 auf dem Platz</w:t>
+              <w:t xml:space="preserve">setzt sich wie gewohnt in die Reihen, findet das Arbeitsblatt auf dem Platz</w:t>
             </w:r>
           </w:p>
         </w:tc>
@@ -2453,7 +2372,7 @@
                 <w:sz w:val="18"/>
                 <w:szCs w:val="18"/>
               </w:rPr>
-              <w:t xml:space="preserve">Impuls: „In welcher Zeile kippt es zum ersten Mal – und warum?“ Wer geantwortet hat, nimmt die nächste Person dran. Ziel: Zeile 3 ★ + 2–3 weitere Kipppunkte (Erwartungshorizont S. 3). Zum Schluss Folie 4 als Sicherung zeigen.</w:t>
+              <w:t xml:space="preserve">Impuls: „In welcher Zeile kippt es zum ersten Mal – und warum?“ Wer geantwortet hat, nimmt die nächste Person dran. Ziel: Zeilen 3, 4, 5, 7 – genau die werden gleich trainiert. Zum Schluss Folie 4.</w:t>
             </w:r>
           </w:p>
         </w:tc>
@@ -2494,7 +2413,7 @@
                 <w:sz w:val="19"/>
                 <w:szCs w:val="19"/>
               </w:rPr>
-              <w:t xml:space="preserve">18–21'</w:t>
+              <w:t xml:space="preserve">18–36'</w:t>
             </w:r>
           </w:p>
         </w:tc>
@@ -2529,7 +2448,7 @@
                 <w:sz w:val="19"/>
                 <w:szCs w:val="19"/>
               </w:rPr>
-              <w:t xml:space="preserve">Umsetzen</w:t>
+              <w:t xml:space="preserve">Technik-Training</w:t>
             </w:r>
           </w:p>
           <w:p>
@@ -2575,7 +2494,7 @@
                 <w:sz w:val="18"/>
                 <w:szCs w:val="18"/>
               </w:rPr>
-              <w:t xml:space="preserve">Wand-, Mittel- und Fensterreihe rücken zu je einer Gruppe zusammen, öffnen ihren Umschlag, verteilen die Rollen</w:t>
+              <w:t xml:space="preserve">Einzelarbeit, Technik für Technik: lesen → Kipppunkt aus M1 umschreiben → prüfen (A Z. 3, B Z. 4, C Z. 5, D Z. 7); danach 2' Vergleich mit dem Sitznachbarn</w:t>
             </w:r>
           </w:p>
         </w:tc>
@@ -2608,7 +2527,7 @@
                 <w:sz w:val="18"/>
                 <w:szCs w:val="18"/>
               </w:rPr>
-              <w:t xml:space="preserve">Folie 5, Timer 3 Min. Nur eingreifen, wenn eine Reihe nicht 7 Personen hat.</w:t>
+              <w:t xml:space="preserve">Folie 5. Timer 4 Min., bei jedem Gong neu starten (22', 26', 30', 34'). Herumgehen und lesen: Wer schreibt noch Du-Botschaften? Zwei gelungene Lösungen pro Technik für das Gespräch vormerken.</w:t>
             </w:r>
           </w:p>
         </w:tc>
@@ -2649,7 +2568,7 @@
                 <w:sz w:val="19"/>
                 <w:szCs w:val="19"/>
               </w:rPr>
-              <w:t xml:space="preserve">21–38'</w:t>
+              <w:t xml:space="preserve">36–43'</w:t>
             </w:r>
           </w:p>
         </w:tc>
@@ -2684,7 +2603,7 @@
                 <w:sz w:val="19"/>
                 <w:szCs w:val="19"/>
               </w:rPr>
-              <w:t xml:space="preserve">Gruppenpuzzle</w:t>
+              <w:t xml:space="preserve">UG 2: Techniken sichern</w:t>
             </w:r>
           </w:p>
           <w:p>
@@ -2698,7 +2617,7 @@
                 <w:sz w:val="16"/>
                 <w:szCs w:val="16"/>
               </w:rPr>
-              <w:t xml:space="preserve">Folie 5</w:t>
+              <w:t xml:space="preserve">Folie 5 → 6 (→ 7)</w:t>
             </w:r>
           </w:p>
         </w:tc>
@@ -2730,7 +2649,7 @@
                 <w:sz w:val="18"/>
                 <w:szCs w:val="18"/>
               </w:rPr>
-              <w:t xml:space="preserve">Expertenkarten verteilen (A einzeln, B–D im Tandem); lesen 4', erklären 7', Dialog umschreiben 6'</w:t>
+              <w:t xml:space="preserve">Pro Technik lesen 1–2 Personen ihre Lösung vor; die Klasse prüft mit der Mini-Checkliste</w:t>
             </w:r>
           </w:p>
         </w:tc>
@@ -2763,7 +2682,7 @@
                 <w:sz w:val="18"/>
                 <w:szCs w:val="18"/>
               </w:rPr>
-              <w:t xml:space="preserve">Timer 17 Min. Bei allen drei Gruppen kurz zuhören. Folie 6 (Werkzeugkasten) noch nicht zeigen – die Klasse soll die Strategien gleich selbst zusammentragen.</w:t>
+              <w:t xml:space="preserve">Impuls: „Wer liest seine Ich-Botschaft vor? – Was ist daran gelungen?“ Gezielt die vorgemerkten Personen drannehmen. Dann Folie 6 zum Vergleich. Folie 7 (ganzer Dialog) nur, wenn Zeit bleibt.</w:t>
             </w:r>
           </w:p>
         </w:tc>
@@ -2804,7 +2723,7 @@
                 <w:sz w:val="19"/>
                 <w:szCs w:val="19"/>
               </w:rPr>
-              <w:t xml:space="preserve">38–45'</w:t>
+              <w:t xml:space="preserve">43–62'</w:t>
             </w:r>
           </w:p>
         </w:tc>
@@ -2839,7 +2758,7 @@
                 <w:sz w:val="19"/>
                 <w:szCs w:val="19"/>
               </w:rPr>
-              <w:t xml:space="preserve">UG 2: Version B + Merkkasten</w:t>
+              <w:t xml:space="preserve">Umsetzen + eigene Szene</w:t>
             </w:r>
           </w:p>
           <w:p>
@@ -2853,7 +2772,7 @@
                 <w:sz w:val="16"/>
                 <w:szCs w:val="16"/>
               </w:rPr>
-              <w:t xml:space="preserve">Folie 5 → 6 → 7</w:t>
+              <w:t xml:space="preserve">Folie 8</w:t>
             </w:r>
           </w:p>
         </w:tc>
@@ -2885,7 +2804,7 @@
                 <w:sz w:val="18"/>
                 <w:szCs w:val="18"/>
               </w:rPr>
-              <w:t xml:space="preserve">Die Protokoll-Person jeder Gruppe liest ihre Version ab Zeile 3 vor; alle füllen den Merkkasten (AB S. 4) aus: Formel und bestes Beispiel je Strategie</w:t>
+              <w:t xml:space="preserve">Reihen rücken zusammen, öffnen den Umschlag, verteilen Rollen (3'); erfinden eine eigene Situation, verteilen Besetzung A und B, proben in den letzten 5'</w:t>
             </w:r>
           </w:p>
         </w:tc>
@@ -2918,7 +2837,7 @@
                 <w:sz w:val="18"/>
                 <w:szCs w:val="18"/>
               </w:rPr>
-              <w:t xml:space="preserve">Impuls: „Welche Strategie erkennt ihr – und an welcher Formulierung?“ Strategie für Strategie (A → D) sammeln, jeweils ein Beispiel aus den Versionen wählen lassen. Dann Folie 6 zum Vergleich, zuletzt Folie 7 (Musterlösung) als eine mögliche Version.</w:t>
+              <w:t xml:space="preserve">Folie 8, Timer 3 + 16 Min. Nach 5 Min. Runde: Hat jede Gruppe eine Idee? Wenn nicht: erst Tippkarte, dann Notfall-Idee. Um ca. 57': eine Person als Moderation gewinnen und ihr die Moderationskarte geben.</w:t>
             </w:r>
           </w:p>
         </w:tc>
@@ -2959,7 +2878,7 @@
                 <w:sz w:val="19"/>
                 <w:szCs w:val="19"/>
               </w:rPr>
-              <w:t xml:space="preserve">45–62'</w:t>
+              <w:t xml:space="preserve">62–75'</w:t>
             </w:r>
           </w:p>
         </w:tc>
@@ -2994,7 +2913,7 @@
                 <w:sz w:val="19"/>
                 <w:szCs w:val="19"/>
               </w:rPr>
-              <w:t xml:space="preserve">Eigene Szene</w:t>
+              <w:t xml:space="preserve">Bühne frei</w:t>
             </w:r>
           </w:p>
           <w:p>
@@ -3008,7 +2927,7 @@
                 <w:sz w:val="16"/>
                 <w:szCs w:val="16"/>
               </w:rPr>
-              <w:t xml:space="preserve">Folie 8</w:t>
+              <w:t xml:space="preserve">Folie 9</w:t>
             </w:r>
           </w:p>
         </w:tc>
@@ -3040,7 +2959,7 @@
                 <w:sz w:val="18"/>
                 <w:szCs w:val="18"/>
               </w:rPr>
-              <w:t xml:space="preserve">erfindet eine eigene Situation, verteilt Besetzung A und B, füllt den Planungsbogen aus (Merkkasten als Hilfe), probt in den letzten 5'</w:t>
+              <w:t xml:space="preserve">Wand → Mitte → Fenster spielen je Version A und B ohne Unterbrechung; das Publikum füllt den Beobachtungsbogen aus</w:t>
             </w:r>
           </w:p>
         </w:tc>
@@ -3073,7 +2992,7 @@
                 <w:sz w:val="18"/>
                 <w:szCs w:val="18"/>
               </w:rPr>
-              <w:t xml:space="preserve">Folie 8, Timer 17 Min. Nach 5 Min. Runde: Hat jede Gruppe eine Idee? Wenn nicht: erst Tippkarte, dann Notfall-Idee. Um ca. 57': eine Person als Moderation gewinnen und ihr die Moderationskarte geben.</w:t>
+              <w:t xml:space="preserve">Folie 9. Ins Publikum setzen, die Moderation leitet. Pro Gruppe ca. 4 Min. Gelungene Formulierungen notieren.</w:t>
             </w:r>
           </w:p>
         </w:tc>
@@ -3114,7 +3033,7 @@
                 <w:sz w:val="19"/>
                 <w:szCs w:val="19"/>
               </w:rPr>
-              <w:t xml:space="preserve">62–75'</w:t>
+              <w:t xml:space="preserve">75–84'</w:t>
             </w:r>
           </w:p>
         </w:tc>
@@ -3149,7 +3068,7 @@
                 <w:sz w:val="19"/>
                 <w:szCs w:val="19"/>
               </w:rPr>
-              <w:t xml:space="preserve">Bühne frei</w:t>
+              <w:t xml:space="preserve">Auswertung</w:t>
             </w:r>
           </w:p>
           <w:p>
@@ -3163,7 +3082,7 @@
                 <w:sz w:val="16"/>
                 <w:szCs w:val="16"/>
               </w:rPr>
-              <w:t xml:space="preserve">Folie 9</w:t>
+              <w:t xml:space="preserve">Folie 10</w:t>
             </w:r>
           </w:p>
         </w:tc>
@@ -3195,7 +3114,7 @@
                 <w:sz w:val="18"/>
                 <w:szCs w:val="18"/>
               </w:rPr>
-              <w:t xml:space="preserve">Wand → Mitte → Fenster spielen je Version A und B ohne Unterbrechung; das Publikum füllt den Beobachtungsbogen aus</w:t>
+              <w:t xml:space="preserve">2' still Bogen ergänzen → 2' Gruppe bespricht die Patenszene → Plenum: je Gruppe ca. 1,5 Min. Rückmeldung</w:t>
             </w:r>
           </w:p>
         </w:tc>
@@ -3228,7 +3147,7 @@
                 <w:sz w:val="18"/>
                 <w:szCs w:val="18"/>
               </w:rPr>
-              <w:t xml:space="preserve">Folie 9. Ins Publikum setzen, die Moderation leitet. Pro Gruppe ca. 4 Min. Gelungene Formulierungen notieren.</w:t>
+              <w:t xml:space="preserve">Folie 10. Die Moderation führt durch die Schritte (oder Sie übernehmen Schritt 3).</w:t>
             </w:r>
           </w:p>
         </w:tc>
@@ -3269,7 +3188,7 @@
                 <w:sz w:val="19"/>
                 <w:szCs w:val="19"/>
               </w:rPr>
-              <w:t xml:space="preserve">75–86'</w:t>
+              <w:t xml:space="preserve">84–90'</w:t>
             </w:r>
           </w:p>
         </w:tc>
@@ -3304,7 +3223,7 @@
                 <w:sz w:val="19"/>
                 <w:szCs w:val="19"/>
               </w:rPr>
-              <w:t xml:space="preserve">Auswertung</w:t>
+              <w:t xml:space="preserve">Exit-Ticket: Mini-Test</w:t>
             </w:r>
           </w:p>
           <w:p>
@@ -3318,7 +3237,7 @@
                 <w:sz w:val="16"/>
                 <w:szCs w:val="16"/>
               </w:rPr>
-              <w:t xml:space="preserve">Folie 10</w:t>
+              <w:t xml:space="preserve">Folie 11</w:t>
             </w:r>
           </w:p>
         </w:tc>
@@ -3350,7 +3269,7 @@
                 <w:sz w:val="18"/>
                 <w:szCs w:val="18"/>
               </w:rPr>
-              <w:t xml:space="preserve">2' still Bogen ergänzen → 3' Gruppe bespricht die Patenszene → Plenum: je Gruppe ca. 2 Min. Rückmeldung, die Spielgruppe ergänzt</w:t>
+              <w:t xml:space="preserve">bearbeitet allein einen neuen Kurzdialog: Kipppunkt benennen, mit zwei Techniken umschreiben</w:t>
             </w:r>
           </w:p>
         </w:tc>
@@ -3383,7 +3302,7 @@
                 <w:sz w:val="18"/>
                 <w:szCs w:val="18"/>
               </w:rPr>
-              <w:t xml:space="preserve">Folie 10. Die Moderation führt durch die Schritte (oder Sie übernehmen Schritt 3). Zum Schluss höchstens 1 Min.: zwei gelungene Formulierungen aus Ihren Notizen vorlesen.</w:t>
+              <w:t xml:space="preserve">Folie 11, Timer 6 Min. Einsammeln an der Tür. Das Format entspricht der Testaufgabe.</w:t>
             </w:r>
           </w:p>
         </w:tc>
@@ -3424,7 +3343,7 @@
                 <w:sz w:val="19"/>
                 <w:szCs w:val="19"/>
               </w:rPr>
-              <w:t xml:space="preserve">86–90'</w:t>
+              <w:t xml:space="preserve">danach</w:t>
             </w:r>
           </w:p>
         </w:tc>
@@ -3459,21 +3378,7 @@
                 <w:sz w:val="19"/>
                 <w:szCs w:val="19"/>
               </w:rPr>
-              <w:t xml:space="preserve">Exit-Ticket</w:t>
-            </w:r>
-          </w:p>
-          <w:p>
-            <w:pPr>
-              <w:spacing w:after="0" w:before="0"/>
-            </w:pPr>
-            <w:r>
-              <w:rPr>
-                <w:rFonts w:ascii="Calibri" w:cs="Calibri" w:eastAsia="Calibri" w:hAnsi="Calibri"/>
-                <w:color w:val="5B6B8C"/>
-                <w:sz w:val="16"/>
-                <w:szCs w:val="16"/>
-              </w:rPr>
-              <w:t xml:space="preserve">Folie 11</w:t>
+              <w:t xml:space="preserve">Nachbereitung</w:t>
             </w:r>
           </w:p>
         </w:tc>
@@ -3505,7 +3410,7 @@
                 <w:sz w:val="18"/>
                 <w:szCs w:val="18"/>
               </w:rPr>
-              <w:t xml:space="preserve">nimmt das Exit-Ticket aus dem Umschlag, bearbeitet es, gibt es an der Tür ab</w:t>
+              <w:t xml:space="preserve"/>
             </w:r>
           </w:p>
         </w:tc>
@@ -3538,148 +3443,7 @@
                 <w:sz w:val="18"/>
                 <w:szCs w:val="18"/>
               </w:rPr>
-              <w:t xml:space="preserve">Folie 11, Timer 4 Min. An die Tür stellen und einsammeln.</w:t>
-            </w:r>
-          </w:p>
-        </w:tc>
-      </w:tr>
-      <w:tr>
-        <w:trPr>
-          <w:cantSplit/>
-          <w:trHeight w:val="500" w:hRule="atLeast"/>
-        </w:trPr>
-        <w:tc>
-          <w:tcPr>
-            <w:tcW w:type="dxa" w:w="1050"/>
-            <w:tcBorders>
-              <w:top w:val="single" w:color="B9C6E8" w:sz="6"/>
-              <w:left w:val="single" w:color="B9C6E8" w:sz="6"/>
-              <w:bottom w:val="single" w:color="B9C6E8" w:sz="6"/>
-              <w:right w:val="single" w:color="B9C6E8" w:sz="6"/>
-            </w:tcBorders>
-            <w:shd w:fill="F4F7FD" w:color="auto" w:val="clear"/>
-            <w:tcMar>
-              <w:top w:type="dxa" w:w="60"/>
-              <w:left w:type="dxa" w:w="100"/>
-              <w:bottom w:type="dxa" w:w="60"/>
-              <w:right w:type="dxa" w:w="100"/>
-            </w:tcMar>
-            <w:vAlign w:val="top"/>
-          </w:tcPr>
-          <w:p>
-            <w:pPr>
-              <w:spacing w:after="0" w:before="0"/>
-            </w:pPr>
-            <w:r>
-              <w:rPr>
-                <w:rFonts w:ascii="Calibri" w:cs="Calibri" w:eastAsia="Calibri" w:hAnsi="Calibri"/>
-                <w:b/>
-                <w:bCs/>
-                <w:color w:val="1E2761"/>
-                <w:sz w:val="19"/>
-                <w:szCs w:val="19"/>
-              </w:rPr>
-              <w:t xml:space="preserve">danach</w:t>
-            </w:r>
-          </w:p>
-        </w:tc>
-        <w:tc>
-          <w:tcPr>
-            <w:tcW w:type="dxa" w:w="1900"/>
-            <w:tcBorders>
-              <w:top w:val="single" w:color="B9C6E8" w:sz="6"/>
-              <w:left w:val="single" w:color="B9C6E8" w:sz="6"/>
-              <w:bottom w:val="single" w:color="B9C6E8" w:sz="6"/>
-              <w:right w:val="single" w:color="B9C6E8" w:sz="6"/>
-            </w:tcBorders>
-            <w:shd w:fill="F4F7FD" w:color="auto" w:val="clear"/>
-            <w:tcMar>
-              <w:top w:type="dxa" w:w="60"/>
-              <w:left w:type="dxa" w:w="100"/>
-              <w:bottom w:type="dxa" w:w="60"/>
-              <w:right w:type="dxa" w:w="100"/>
-            </w:tcMar>
-            <w:vAlign w:val="top"/>
-          </w:tcPr>
-          <w:p>
-            <w:pPr>
-              <w:spacing w:after="10" w:before="0"/>
-            </w:pPr>
-            <w:r>
-              <w:rPr>
-                <w:rFonts w:ascii="Calibri" w:cs="Calibri" w:eastAsia="Calibri" w:hAnsi="Calibri"/>
-                <w:b/>
-                <w:bCs/>
-                <w:color w:val="000000"/>
-                <w:sz w:val="19"/>
-                <w:szCs w:val="19"/>
-              </w:rPr>
-              <w:t xml:space="preserve">Nachbereitung</w:t>
-            </w:r>
-          </w:p>
-        </w:tc>
-        <w:tc>
-          <w:tcPr>
-            <w:tcW w:type="dxa" w:w="3150"/>
-            <w:tcBorders>
-              <w:top w:val="single" w:color="B9C6E8" w:sz="6"/>
-              <w:left w:val="single" w:color="B9C6E8" w:sz="6"/>
-              <w:bottom w:val="single" w:color="B9C6E8" w:sz="6"/>
-              <w:right w:val="single" w:color="B9C6E8" w:sz="6"/>
-            </w:tcBorders>
-            <w:tcMar>
-              <w:top w:type="dxa" w:w="60"/>
-              <w:left w:type="dxa" w:w="100"/>
-              <w:bottom w:type="dxa" w:w="60"/>
-              <w:right w:type="dxa" w:w="100"/>
-            </w:tcMar>
-            <w:vAlign w:val="top"/>
-          </w:tcPr>
-          <w:p>
-            <w:pPr>
-              <w:spacing w:after="0" w:before="0"/>
-            </w:pPr>
-            <w:r>
-              <w:rPr>
-                <w:rFonts w:ascii="Calibri" w:cs="Calibri" w:eastAsia="Calibri" w:hAnsi="Calibri"/>
-                <w:color w:val="000000"/>
-                <w:sz w:val="18"/>
-                <w:szCs w:val="18"/>
-              </w:rPr>
-              <w:t xml:space="preserve"/>
-            </w:r>
-          </w:p>
-        </w:tc>
-        <w:tc>
-          <w:tcPr>
-            <w:tcW w:type="dxa" w:w="4106"/>
-            <w:tcBorders>
-              <w:top w:val="single" w:color="B9C6E8" w:sz="6"/>
-              <w:left w:val="single" w:color="B9C6E8" w:sz="6"/>
-              <w:bottom w:val="single" w:color="B9C6E8" w:sz="6"/>
-              <w:right w:val="single" w:color="B9C6E8" w:sz="6"/>
-            </w:tcBorders>
-            <w:shd w:fill="EAF0FA" w:color="auto" w:val="clear"/>
-            <w:tcMar>
-              <w:top w:type="dxa" w:w="60"/>
-              <w:left w:type="dxa" w:w="100"/>
-              <w:bottom w:type="dxa" w:w="60"/>
-              <w:right w:type="dxa" w:w="100"/>
-            </w:tcMar>
-            <w:vAlign w:val="top"/>
-          </w:tcPr>
-          <w:p>
-            <w:pPr>
-              <w:spacing w:after="0" w:before="0"/>
-            </w:pPr>
-            <w:r>
-              <w:rPr>
-                <w:rFonts w:ascii="Calibri" w:cs="Calibri" w:eastAsia="Calibri" w:hAnsi="Calibri"/>
-                <w:color w:val="000000"/>
-                <w:sz w:val="18"/>
-                <w:szCs w:val="18"/>
-              </w:rPr>
-              <w:t xml:space="preserve">Exit-Tickets sichten: Wer kann schon eine Ich-Botschaft mit Bitte formulieren? 2–3 gute Beispiele als Einstieg für die nächste Stunde auswählen.</w:t>
+              <w:t xml:space="preserve">Mini-Tests sichten (Erwartungshorizont S. 4): Wer kann einen Kipppunkt allein umschreiben? Welche Technik gelingt noch nicht? Daraus die Übung für die nächste Stunde ableiten.</w:t>
             </w:r>
           </w:p>
         </w:tc>
@@ -4711,7 +4475,7 @@
           <w:sz w:val="18"/>
           <w:szCs w:val="18"/>
         </w:rPr>
-        <w:t xml:space="preserve">ERWARTUNGSHORIZONT · UNTERRICHTSGESPRÄCH 2 · AUFGABE 3 (AUCH FOLIE 7; MERKKASTEN = FOLIE 6)</w:t>
+        <w:t xml:space="preserve">ERWARTUNGSHORIZONT · TECHNIK-TRAINING (AUFGABE 3) UND MINI-TEST</w:t>
       </w:r>
     </w:p>
     <w:p>
@@ -4727,7 +4491,7 @@
           <w:sz w:val="40"/>
           <w:szCs w:val="40"/>
         </w:rPr>
-        <w:t xml:space="preserve">So hätte es laufen können</w:t>
+        <w:t xml:space="preserve">So können die Kipppunkte klingen</w:t>
       </w:r>
     </w:p>
     <w:p>
@@ -4743,7 +4507,7 @@
           <w:sz w:val="20"/>
           <w:szCs w:val="20"/>
         </w:rPr>
-        <w:t xml:space="preserve">Eine mögliche Version B. Die Versionen der Gruppen dürfen ganz anders klingen – entscheidend ist, dass sie die Checkliste erfüllen.</w:t>
+        <w:t xml:space="preserve">Mögliche Lösungen – Schülerlösungen dürfen ganz anders klingen. Entscheidend ist, dass die Merkmale der Technik erkennbar sind.</w:t>
       </w:r>
     </w:p>
     <w:tbl>
@@ -4759,10 +4523,10 @@
         </w:tblBorders>
       </w:tblPr>
       <w:tblGrid>
-        <w:gridCol w:w="700"/>
-        <w:gridCol w:w="1100"/>
-        <w:gridCol w:w="6906"/>
-        <w:gridCol w:w="1500"/>
+        <w:gridCol w:w="900"/>
+        <w:gridCol w:w="1900"/>
+        <w:gridCol w:w="5006"/>
+        <w:gridCol w:w="2400"/>
       </w:tblGrid>
       <w:tr>
         <w:trPr>
@@ -4771,7 +4535,7 @@
         </w:trPr>
         <w:tc>
           <w:tcPr>
-            <w:tcW w:type="dxa" w:w="700"/>
+            <w:tcW w:type="dxa" w:w="900"/>
             <w:tcBorders>
               <w:top w:val="single" w:color="B9C6E8" w:sz="6"/>
               <w:left w:val="single" w:color="B9C6E8" w:sz="6"/>
@@ -4801,13 +4565,13 @@
                 <w:sz w:val="20"/>
                 <w:szCs w:val="20"/>
               </w:rPr>
-              <w:t xml:space="preserve">Z.</w:t>
-            </w:r>
-          </w:p>
-        </w:tc>
-        <w:tc>
-          <w:tcPr>
-            <w:tcW w:type="dxa" w:w="1100"/>
+              <w:t xml:space="preserve">Zeile</w:t>
+            </w:r>
+          </w:p>
+        </w:tc>
+        <w:tc>
+          <w:tcPr>
+            <w:tcW w:type="dxa" w:w="1900"/>
             <w:tcBorders>
               <w:top w:val="single" w:color="B9C6E8" w:sz="6"/>
               <w:left w:val="single" w:color="B9C6E8" w:sz="6"/>
@@ -4837,13 +4601,13 @@
                 <w:sz w:val="20"/>
                 <w:szCs w:val="20"/>
               </w:rPr>
-              <w:t xml:space="preserve">Wer</w:t>
-            </w:r>
-          </w:p>
-        </w:tc>
-        <w:tc>
-          <w:tcPr>
-            <w:tcW w:type="dxa" w:w="6906"/>
+              <w:t xml:space="preserve">Technik</w:t>
+            </w:r>
+          </w:p>
+        </w:tc>
+        <w:tc>
+          <w:tcPr>
+            <w:tcW w:type="dxa" w:w="5006"/>
             <w:tcBorders>
               <w:top w:val="single" w:color="B9C6E8" w:sz="6"/>
               <w:left w:val="single" w:color="B9C6E8" w:sz="6"/>
@@ -4873,13 +4637,13 @@
                 <w:sz w:val="20"/>
                 <w:szCs w:val="20"/>
               </w:rPr>
-              <w:t xml:space="preserve">Version B</w:t>
-            </w:r>
-          </w:p>
-        </w:tc>
-        <w:tc>
-          <w:tcPr>
-            <w:tcW w:type="dxa" w:w="1500"/>
+              <w:t xml:space="preserve">Mögliche Lösung</w:t>
+            </w:r>
+          </w:p>
+        </w:tc>
+        <w:tc>
+          <w:tcPr>
+            <w:tcW w:type="dxa" w:w="2400"/>
             <w:tcBorders>
               <w:top w:val="single" w:color="B9C6E8" w:sz="6"/>
               <w:left w:val="single" w:color="B9C6E8" w:sz="6"/>
@@ -4909,7 +4673,7 @@
                 <w:sz w:val="20"/>
                 <w:szCs w:val="20"/>
               </w:rPr>
-              <w:t xml:space="preserve">Strategie</w:t>
+              <w:t xml:space="preserve">Daran erkennt man’s</w:t>
             </w:r>
           </w:p>
         </w:tc>
@@ -4917,11 +4681,11 @@
       <w:tr>
         <w:trPr>
           <w:cantSplit/>
-          <w:trHeight w:val="640" w:hRule="atLeast"/>
+          <w:trHeight w:val="1000" w:hRule="atLeast"/>
         </w:trPr>
         <w:tc>
           <w:tcPr>
-            <w:tcW w:type="dxa" w:w="700"/>
+            <w:tcW w:type="dxa" w:w="900"/>
             <w:tcBorders>
               <w:top w:val="single" w:color="B9C6E8" w:sz="6"/>
               <w:left w:val="single" w:color="B9C6E8" w:sz="6"/>
@@ -4947,7 +4711,7 @@
                 <w:rFonts w:ascii="Calibri" w:cs="Calibri" w:eastAsia="Calibri" w:hAnsi="Calibri"/>
                 <w:b/>
                 <w:bCs/>
-                <w:color w:val="5B6B8C"/>
+                <w:color w:val="D9534F"/>
                 <w:sz w:val="22"/>
                 <w:szCs w:val="22"/>
               </w:rPr>
@@ -4957,7 +4721,7 @@
         </w:tc>
         <w:tc>
           <w:tcPr>
-            <w:tcW w:type="dxa" w:w="1100"/>
+            <w:tcW w:type="dxa" w:w="1900"/>
             <w:tcBorders>
               <w:top w:val="single" w:color="B9C6E8" w:sz="6"/>
               <w:left w:val="single" w:color="B9C6E8" w:sz="6"/>
@@ -4979,70 +4743,19 @@
             </w:pPr>
             <w:r>
               <w:rPr>
-                <w:rFonts w:ascii="Calibri" w:cs="Calibri" w:eastAsia="Calibri" w:hAnsi="Calibri"/>
-                <w:b/>
-                <w:bCs/>
-                <w:color w:val="1E2761"/>
-                <w:sz w:val="22"/>
-                <w:szCs w:val="22"/>
-              </w:rPr>
-              <w:t xml:space="preserve">Lena</w:t>
-            </w:r>
-          </w:p>
-        </w:tc>
-        <w:tc>
-          <w:tcPr>
-            <w:tcW w:type="dxa" w:w="6906"/>
-            <w:tcBorders>
-              <w:top w:val="single" w:color="B9C6E8" w:sz="6"/>
-              <w:left w:val="single" w:color="B9C6E8" w:sz="6"/>
-              <w:bottom w:val="single" w:color="B9C6E8" w:sz="6"/>
-              <w:right w:val="single" w:color="B9C6E8" w:sz="6"/>
-            </w:tcBorders>
-            <w:tcMar>
-              <w:top w:type="dxa" w:w="60"/>
-              <w:left w:type="dxa" w:w="100"/>
-              <w:bottom w:type="dxa" w:w="60"/>
-              <w:right w:type="dxa" w:w="100"/>
-            </w:tcMar>
-            <w:vAlign w:val="center"/>
-          </w:tcPr>
-          <w:p>
-            <w:pPr>
-              <w:spacing w:after="0" w:before="0"/>
-            </w:pPr>
-            <w:r>
-              <w:rPr>
                 <w:rFonts w:ascii="Cambria" w:cs="Cambria" w:eastAsia="Cambria" w:hAnsi="Cambria"/>
-                <w:color w:val="000000"/>
-                <w:sz w:val="21"/>
-                <w:szCs w:val="21"/>
-              </w:rPr>
-              <w:t xml:space="preserve">Heute Abend? Ehrlich gesagt macht mich das nervös, weil wir morgen schon dran sind und ich die Folien vorher einmal sehen wollte.</w:t>
-            </w:r>
-          </w:p>
-        </w:tc>
-        <w:tc>
-          <w:tcPr>
-            <w:tcW w:type="dxa" w:w="1500"/>
-            <w:tcBorders>
-              <w:top w:val="single" w:color="B9C6E8" w:sz="6"/>
-              <w:left w:val="single" w:color="B9C6E8" w:sz="6"/>
-              <w:bottom w:val="single" w:color="B9C6E8" w:sz="6"/>
-              <w:right w:val="single" w:color="B9C6E8" w:sz="6"/>
-            </w:tcBorders>
-            <w:tcMar>
-              <w:top w:type="dxa" w:w="60"/>
-              <w:left w:type="dxa" w:w="100"/>
-              <w:bottom w:type="dxa" w:w="60"/>
-              <w:right w:type="dxa" w:w="100"/>
-            </w:tcMar>
-            <w:vAlign w:val="center"/>
-          </w:tcPr>
-          <w:p>
-            <w:pPr>
-              <w:spacing w:after="0" w:before="0"/>
-              <w:jc w:val="center"/>
+                <w:b/>
+                <w:bCs/>
+                <w:color w:val="3F7CC4"/>
+                <w:sz w:val="30"/>
+                <w:szCs w:val="30"/>
+              </w:rPr>
+              <w:t xml:space="preserve">A</w:t>
+            </w:r>
+          </w:p>
+          <w:p>
+            <w:pPr>
+              <w:spacing w:after="0" w:before="0"/>
             </w:pPr>
             <w:r>
               <w:rPr>
@@ -5053,7 +4766,72 @@
                 <w:sz w:val="18"/>
                 <w:szCs w:val="18"/>
               </w:rPr>
-              <w:t xml:space="preserve">A Ich-Botschaft</w:t>
+              <w:t xml:space="preserve">Ich-Botschaft</w:t>
+            </w:r>
+          </w:p>
+        </w:tc>
+        <w:tc>
+          <w:tcPr>
+            <w:tcW w:type="dxa" w:w="5006"/>
+            <w:tcBorders>
+              <w:top w:val="single" w:color="B9C6E8" w:sz="6"/>
+              <w:left w:val="single" w:color="B9C6E8" w:sz="6"/>
+              <w:bottom w:val="single" w:color="B9C6E8" w:sz="6"/>
+              <w:right w:val="single" w:color="B9C6E8" w:sz="6"/>
+            </w:tcBorders>
+            <w:tcMar>
+              <w:top w:type="dxa" w:w="60"/>
+              <w:left w:type="dxa" w:w="100"/>
+              <w:bottom w:type="dxa" w:w="60"/>
+              <w:right w:type="dxa" w:w="100"/>
+            </w:tcMar>
+            <w:vAlign w:val="center"/>
+          </w:tcPr>
+          <w:p>
+            <w:pPr>
+              <w:spacing w:after="0" w:before="0"/>
+            </w:pPr>
+            <w:r>
+              <w:rPr>
+                <w:rFonts w:ascii="Cambria" w:cs="Cambria" w:eastAsia="Cambria" w:hAnsi="Cambria"/>
+                <w:color w:val="000000"/>
+                <w:sz w:val="20"/>
+                <w:szCs w:val="20"/>
+              </w:rPr>
+              <w:t xml:space="preserve">„Heute Abend? Ehrlich gesagt macht mich das nervös, weil wir morgen schon dran sind und ich die Folien vorher einmal sehen wollte.“</w:t>
+            </w:r>
+          </w:p>
+        </w:tc>
+        <w:tc>
+          <w:tcPr>
+            <w:tcW w:type="dxa" w:w="2400"/>
+            <w:tcBorders>
+              <w:top w:val="single" w:color="B9C6E8" w:sz="6"/>
+              <w:left w:val="single" w:color="B9C6E8" w:sz="6"/>
+              <w:bottom w:val="single" w:color="B9C6E8" w:sz="6"/>
+              <w:right w:val="single" w:color="B9C6E8" w:sz="6"/>
+            </w:tcBorders>
+            <w:shd w:fill="EAF0FA" w:color="auto" w:val="clear"/>
+            <w:tcMar>
+              <w:top w:type="dxa" w:w="60"/>
+              <w:left w:type="dxa" w:w="100"/>
+              <w:bottom w:type="dxa" w:w="60"/>
+              <w:right w:type="dxa" w:w="100"/>
+            </w:tcMar>
+            <w:vAlign w:val="center"/>
+          </w:tcPr>
+          <w:p>
+            <w:pPr>
+              <w:spacing w:after="0" w:before="0"/>
+            </w:pPr>
+            <w:r>
+              <w:rPr>
+                <w:rFonts w:ascii="Calibri" w:cs="Calibri" w:eastAsia="Calibri" w:hAnsi="Calibri"/>
+                <w:color w:val="000000"/>
+                <w:sz w:val="18"/>
+                <w:szCs w:val="18"/>
+              </w:rPr>
+              <w:t xml:space="preserve">Ich-Form · Gefühl (nervös) · Grund · kein Vorwurf</w:t>
             </w:r>
           </w:p>
         </w:tc>
@@ -5061,11 +4839,11 @@
       <w:tr>
         <w:trPr>
           <w:cantSplit/>
-          <w:trHeight w:val="640" w:hRule="atLeast"/>
+          <w:trHeight w:val="1000" w:hRule="atLeast"/>
         </w:trPr>
         <w:tc>
           <w:tcPr>
-            <w:tcW w:type="dxa" w:w="700"/>
+            <w:tcW w:type="dxa" w:w="900"/>
             <w:tcBorders>
               <w:top w:val="single" w:color="B9C6E8" w:sz="6"/>
               <w:left w:val="single" w:color="B9C6E8" w:sz="6"/>
@@ -5091,7 +4869,7 @@
                 <w:rFonts w:ascii="Calibri" w:cs="Calibri" w:eastAsia="Calibri" w:hAnsi="Calibri"/>
                 <w:b/>
                 <w:bCs/>
-                <w:color w:val="5B6B8C"/>
+                <w:color w:val="D9534F"/>
                 <w:sz w:val="22"/>
                 <w:szCs w:val="22"/>
               </w:rPr>
@@ -5101,7 +4879,7 @@
         </w:tc>
         <w:tc>
           <w:tcPr>
-            <w:tcW w:type="dxa" w:w="1100"/>
+            <w:tcW w:type="dxa" w:w="1900"/>
             <w:tcBorders>
               <w:top w:val="single" w:color="B9C6E8" w:sz="6"/>
               <w:left w:val="single" w:color="B9C6E8" w:sz="6"/>
@@ -5123,70 +4901,19 @@
             </w:pPr>
             <w:r>
               <w:rPr>
-                <w:rFonts w:ascii="Calibri" w:cs="Calibri" w:eastAsia="Calibri" w:hAnsi="Calibri"/>
-                <w:b/>
-                <w:bCs/>
-                <w:color w:val="1E2761"/>
-                <w:sz w:val="22"/>
-                <w:szCs w:val="22"/>
-              </w:rPr>
-              <w:t xml:space="preserve">Tom</w:t>
-            </w:r>
-          </w:p>
-        </w:tc>
-        <w:tc>
-          <w:tcPr>
-            <w:tcW w:type="dxa" w:w="6906"/>
-            <w:tcBorders>
-              <w:top w:val="single" w:color="B9C6E8" w:sz="6"/>
-              <w:left w:val="single" w:color="B9C6E8" w:sz="6"/>
-              <w:bottom w:val="single" w:color="B9C6E8" w:sz="6"/>
-              <w:right w:val="single" w:color="B9C6E8" w:sz="6"/>
-            </w:tcBorders>
-            <w:tcMar>
-              <w:top w:type="dxa" w:w="60"/>
-              <w:left w:type="dxa" w:w="100"/>
-              <w:bottom w:type="dxa" w:w="60"/>
-              <w:right w:type="dxa" w:w="100"/>
-            </w:tcMar>
-            <w:vAlign w:val="center"/>
-          </w:tcPr>
-          <w:p>
-            <w:pPr>
-              <w:spacing w:after="0" w:before="0"/>
-            </w:pPr>
-            <w:r>
-              <w:rPr>
                 <w:rFonts w:ascii="Cambria" w:cs="Cambria" w:eastAsia="Cambria" w:hAnsi="Cambria"/>
-                <w:color w:val="000000"/>
-                <w:sz w:val="21"/>
-                <w:szCs w:val="21"/>
-              </w:rPr>
-              <w:t xml:space="preserve">Verstehe ich. Du willst sicher sein, dass alles passt, oder? Ich hatte diese Woche dreimal Training und hab’s unterschätzt.</w:t>
-            </w:r>
-          </w:p>
-        </w:tc>
-        <w:tc>
-          <w:tcPr>
-            <w:tcW w:type="dxa" w:w="1500"/>
-            <w:tcBorders>
-              <w:top w:val="single" w:color="B9C6E8" w:sz="6"/>
-              <w:left w:val="single" w:color="B9C6E8" w:sz="6"/>
-              <w:bottom w:val="single" w:color="B9C6E8" w:sz="6"/>
-              <w:right w:val="single" w:color="B9C6E8" w:sz="6"/>
-            </w:tcBorders>
-            <w:tcMar>
-              <w:top w:type="dxa" w:w="60"/>
-              <w:left w:type="dxa" w:w="100"/>
-              <w:bottom w:type="dxa" w:w="60"/>
-              <w:right w:type="dxa" w:w="100"/>
-            </w:tcMar>
-            <w:vAlign w:val="center"/>
-          </w:tcPr>
-          <w:p>
-            <w:pPr>
-              <w:spacing w:after="0" w:before="0"/>
-              <w:jc w:val="center"/>
+                <w:b/>
+                <w:bCs/>
+                <w:color w:val="2E9E6B"/>
+                <w:sz w:val="30"/>
+                <w:szCs w:val="30"/>
+              </w:rPr>
+              <w:t xml:space="preserve">B</w:t>
+            </w:r>
+          </w:p>
+          <w:p>
+            <w:pPr>
+              <w:spacing w:after="0" w:before="0"/>
             </w:pPr>
             <w:r>
               <w:rPr>
@@ -5197,7 +4924,72 @@
                 <w:sz w:val="18"/>
                 <w:szCs w:val="18"/>
               </w:rPr>
-              <w:t xml:space="preserve">B Empathie</w:t>
+              <w:t xml:space="preserve">Empathie</w:t>
+            </w:r>
+          </w:p>
+        </w:tc>
+        <w:tc>
+          <w:tcPr>
+            <w:tcW w:type="dxa" w:w="5006"/>
+            <w:tcBorders>
+              <w:top w:val="single" w:color="B9C6E8" w:sz="6"/>
+              <w:left w:val="single" w:color="B9C6E8" w:sz="6"/>
+              <w:bottom w:val="single" w:color="B9C6E8" w:sz="6"/>
+              <w:right w:val="single" w:color="B9C6E8" w:sz="6"/>
+            </w:tcBorders>
+            <w:tcMar>
+              <w:top w:type="dxa" w:w="60"/>
+              <w:left w:type="dxa" w:w="100"/>
+              <w:bottom w:type="dxa" w:w="60"/>
+              <w:right w:type="dxa" w:w="100"/>
+            </w:tcMar>
+            <w:vAlign w:val="center"/>
+          </w:tcPr>
+          <w:p>
+            <w:pPr>
+              <w:spacing w:after="0" w:before="0"/>
+            </w:pPr>
+            <w:r>
+              <w:rPr>
+                <w:rFonts w:ascii="Cambria" w:cs="Cambria" w:eastAsia="Cambria" w:hAnsi="Cambria"/>
+                <w:color w:val="000000"/>
+                <w:sz w:val="20"/>
+                <w:szCs w:val="20"/>
+              </w:rPr>
+              <w:t xml:space="preserve">„Du bist gestresst, weil morgen alles klappen soll, oder? Das verstehe ich. Ich hab’s mit dem Training unterschätzt.“</w:t>
+            </w:r>
+          </w:p>
+        </w:tc>
+        <w:tc>
+          <w:tcPr>
+            <w:tcW w:type="dxa" w:w="2400"/>
+            <w:tcBorders>
+              <w:top w:val="single" w:color="B9C6E8" w:sz="6"/>
+              <w:left w:val="single" w:color="B9C6E8" w:sz="6"/>
+              <w:bottom w:val="single" w:color="B9C6E8" w:sz="6"/>
+              <w:right w:val="single" w:color="B9C6E8" w:sz="6"/>
+            </w:tcBorders>
+            <w:shd w:fill="EAF0FA" w:color="auto" w:val="clear"/>
+            <w:tcMar>
+              <w:top w:type="dxa" w:w="60"/>
+              <w:left w:type="dxa" w:w="100"/>
+              <w:bottom w:type="dxa" w:w="60"/>
+              <w:right w:type="dxa" w:w="100"/>
+            </w:tcMar>
+            <w:vAlign w:val="center"/>
+          </w:tcPr>
+          <w:p>
+            <w:pPr>
+              <w:spacing w:after="0" w:before="0"/>
+            </w:pPr>
+            <w:r>
+              <w:rPr>
+                <w:rFonts w:ascii="Calibri" w:cs="Calibri" w:eastAsia="Calibri" w:hAnsi="Calibri"/>
+                <w:color w:val="000000"/>
+                <w:sz w:val="18"/>
+                <w:szCs w:val="18"/>
+              </w:rPr>
+              <w:t xml:space="preserve">Gefühl des anderen benannt · erst verstehen, dann erklären · kein Gegenangriff</w:t>
             </w:r>
           </w:p>
         </w:tc>
@@ -5205,11 +4997,11 @@
       <w:tr>
         <w:trPr>
           <w:cantSplit/>
-          <w:trHeight w:val="640" w:hRule="atLeast"/>
+          <w:trHeight w:val="1000" w:hRule="atLeast"/>
         </w:trPr>
         <w:tc>
           <w:tcPr>
-            <w:tcW w:type="dxa" w:w="700"/>
+            <w:tcW w:type="dxa" w:w="900"/>
             <w:tcBorders>
               <w:top w:val="single" w:color="B9C6E8" w:sz="6"/>
               <w:left w:val="single" w:color="B9C6E8" w:sz="6"/>
@@ -5235,7 +5027,7 @@
                 <w:rFonts w:ascii="Calibri" w:cs="Calibri" w:eastAsia="Calibri" w:hAnsi="Calibri"/>
                 <w:b/>
                 <w:bCs/>
-                <w:color w:val="5B6B8C"/>
+                <w:color w:val="D9534F"/>
                 <w:sz w:val="22"/>
                 <w:szCs w:val="22"/>
               </w:rPr>
@@ -5245,7 +5037,7 @@
         </w:tc>
         <w:tc>
           <w:tcPr>
-            <w:tcW w:type="dxa" w:w="1100"/>
+            <w:tcW w:type="dxa" w:w="1900"/>
             <w:tcBorders>
               <w:top w:val="single" w:color="B9C6E8" w:sz="6"/>
               <w:left w:val="single" w:color="B9C6E8" w:sz="6"/>
@@ -5267,81 +5059,95 @@
             </w:pPr>
             <w:r>
               <w:rPr>
-                <w:rFonts w:ascii="Calibri" w:cs="Calibri" w:eastAsia="Calibri" w:hAnsi="Calibri"/>
-                <w:b/>
-                <w:bCs/>
-                <w:color w:val="1E2761"/>
-                <w:sz w:val="22"/>
-                <w:szCs w:val="22"/>
-              </w:rPr>
-              <w:t xml:space="preserve">Lena</w:t>
-            </w:r>
-          </w:p>
-        </w:tc>
-        <w:tc>
-          <w:tcPr>
-            <w:tcW w:type="dxa" w:w="6906"/>
-            <w:tcBorders>
-              <w:top w:val="single" w:color="B9C6E8" w:sz="6"/>
-              <w:left w:val="single" w:color="B9C6E8" w:sz="6"/>
-              <w:bottom w:val="single" w:color="B9C6E8" w:sz="6"/>
-              <w:right w:val="single" w:color="B9C6E8" w:sz="6"/>
-            </w:tcBorders>
-            <w:tcMar>
-              <w:top w:type="dxa" w:w="60"/>
-              <w:left w:type="dxa" w:w="100"/>
-              <w:bottom w:type="dxa" w:w="60"/>
-              <w:right w:type="dxa" w:w="100"/>
-            </w:tcMar>
-            <w:vAlign w:val="center"/>
-          </w:tcPr>
-          <w:p>
-            <w:pPr>
-              <w:spacing w:after="0" w:before="0"/>
-            </w:pPr>
-            <w:r>
-              <w:rPr>
                 <w:rFonts w:ascii="Cambria" w:cs="Cambria" w:eastAsia="Cambria" w:hAnsi="Cambria"/>
-                <w:color w:val="000000"/>
-                <w:sz w:val="21"/>
-                <w:szCs w:val="21"/>
-              </w:rPr>
-              <w:t xml:space="preserve">Ja, genau. Ich hab schon die Gliederung gemacht und fühl mich gerade ein bisschen allein mit dem Ganzen.</w:t>
-            </w:r>
-          </w:p>
-        </w:tc>
-        <w:tc>
-          <w:tcPr>
-            <w:tcW w:type="dxa" w:w="1500"/>
-            <w:tcBorders>
-              <w:top w:val="single" w:color="B9C6E8" w:sz="6"/>
-              <w:left w:val="single" w:color="B9C6E8" w:sz="6"/>
-              <w:bottom w:val="single" w:color="B9C6E8" w:sz="6"/>
-              <w:right w:val="single" w:color="B9C6E8" w:sz="6"/>
-            </w:tcBorders>
-            <w:tcMar>
-              <w:top w:type="dxa" w:w="60"/>
-              <w:left w:type="dxa" w:w="100"/>
-              <w:bottom w:type="dxa" w:w="60"/>
-              <w:right w:type="dxa" w:w="100"/>
-            </w:tcMar>
-            <w:vAlign w:val="center"/>
-          </w:tcPr>
-          <w:p>
-            <w:pPr>
-              <w:spacing w:after="0" w:before="0"/>
-              <w:jc w:val="center"/>
-            </w:pPr>
-            <w:r>
-              <w:rPr>
-                <w:rFonts w:ascii="Calibri" w:cs="Calibri" w:eastAsia="Calibri" w:hAnsi="Calibri"/>
-                <w:b/>
-                <w:bCs/>
-                <w:color w:val="3F7CC4"/>
+                <w:b/>
+                <w:bCs/>
+                <w:color w:val="E8A33D"/>
+                <w:sz w:val="30"/>
+                <w:szCs w:val="30"/>
+              </w:rPr>
+              <w:t xml:space="preserve">C</w:t>
+            </w:r>
+          </w:p>
+          <w:p>
+            <w:pPr>
+              <w:spacing w:after="0" w:before="0"/>
+            </w:pPr>
+            <w:r>
+              <w:rPr>
+                <w:rFonts w:ascii="Calibri" w:cs="Calibri" w:eastAsia="Calibri" w:hAnsi="Calibri"/>
+                <w:b/>
+                <w:bCs/>
+                <w:color w:val="E8A33D"/>
                 <w:sz w:val="18"/>
                 <w:szCs w:val="18"/>
               </w:rPr>
-              <w:t xml:space="preserve">A Ich-Botschaft</w:t>
+              <w:t xml:space="preserve">Wunsch &amp; Bitte</w:t>
+            </w:r>
+          </w:p>
+        </w:tc>
+        <w:tc>
+          <w:tcPr>
+            <w:tcW w:type="dxa" w:w="5006"/>
+            <w:tcBorders>
+              <w:top w:val="single" w:color="B9C6E8" w:sz="6"/>
+              <w:left w:val="single" w:color="B9C6E8" w:sz="6"/>
+              <w:bottom w:val="single" w:color="B9C6E8" w:sz="6"/>
+              <w:right w:val="single" w:color="B9C6E8" w:sz="6"/>
+            </w:tcBorders>
+            <w:tcMar>
+              <w:top w:type="dxa" w:w="60"/>
+              <w:left w:type="dxa" w:w="100"/>
+              <w:bottom w:type="dxa" w:w="60"/>
+              <w:right w:type="dxa" w:w="100"/>
+            </w:tcMar>
+            <w:vAlign w:val="center"/>
+          </w:tcPr>
+          <w:p>
+            <w:pPr>
+              <w:spacing w:after="0" w:before="0"/>
+            </w:pPr>
+            <w:r>
+              <w:rPr>
+                <w:rFonts w:ascii="Cambria" w:cs="Cambria" w:eastAsia="Cambria" w:hAnsi="Cambria"/>
+                <w:color w:val="000000"/>
+                <w:sz w:val="20"/>
+                <w:szCs w:val="20"/>
+              </w:rPr>
+              <w:t xml:space="preserve">„Mir ist wichtig, dass wir morgen sicher sind. Kannst du mir die Folien bis 19 Uhr schicken, damit ich drüberschauen kann?“</w:t>
+            </w:r>
+          </w:p>
+        </w:tc>
+        <w:tc>
+          <w:tcPr>
+            <w:tcW w:type="dxa" w:w="2400"/>
+            <w:tcBorders>
+              <w:top w:val="single" w:color="B9C6E8" w:sz="6"/>
+              <w:left w:val="single" w:color="B9C6E8" w:sz="6"/>
+              <w:bottom w:val="single" w:color="B9C6E8" w:sz="6"/>
+              <w:right w:val="single" w:color="B9C6E8" w:sz="6"/>
+            </w:tcBorders>
+            <w:shd w:fill="EAF0FA" w:color="auto" w:val="clear"/>
+            <w:tcMar>
+              <w:top w:type="dxa" w:w="60"/>
+              <w:left w:type="dxa" w:w="100"/>
+              <w:bottom w:type="dxa" w:w="60"/>
+              <w:right w:type="dxa" w:w="100"/>
+            </w:tcMar>
+            <w:vAlign w:val="center"/>
+          </w:tcPr>
+          <w:p>
+            <w:pPr>
+              <w:spacing w:after="0" w:before="0"/>
+            </w:pPr>
+            <w:r>
+              <w:rPr>
+                <w:rFonts w:ascii="Calibri" w:cs="Calibri" w:eastAsia="Calibri" w:hAnsi="Calibri"/>
+                <w:color w:val="000000"/>
+                <w:sz w:val="18"/>
+                <w:szCs w:val="18"/>
+              </w:rPr>
+              <w:t xml:space="preserve">Bedürfnis statt „immer“ · konkret: wer, was, bis wann · als Frage</w:t>
             </w:r>
           </w:p>
         </w:tc>
@@ -5349,11 +5155,11 @@
       <w:tr>
         <w:trPr>
           <w:cantSplit/>
-          <w:trHeight w:val="640" w:hRule="atLeast"/>
+          <w:trHeight w:val="1000" w:hRule="atLeast"/>
         </w:trPr>
         <w:tc>
           <w:tcPr>
-            <w:tcW w:type="dxa" w:w="700"/>
+            <w:tcW w:type="dxa" w:w="900"/>
             <w:tcBorders>
               <w:top w:val="single" w:color="B9C6E8" w:sz="6"/>
               <w:left w:val="single" w:color="B9C6E8" w:sz="6"/>
@@ -5379,17 +5185,17 @@
                 <w:rFonts w:ascii="Calibri" w:cs="Calibri" w:eastAsia="Calibri" w:hAnsi="Calibri"/>
                 <w:b/>
                 <w:bCs/>
-                <w:color w:val="5B6B8C"/>
+                <w:color w:val="D9534F"/>
                 <w:sz w:val="22"/>
                 <w:szCs w:val="22"/>
               </w:rPr>
-              <w:t xml:space="preserve">6</w:t>
-            </w:r>
-          </w:p>
-        </w:tc>
-        <w:tc>
-          <w:tcPr>
-            <w:tcW w:type="dxa" w:w="1100"/>
+              <w:t xml:space="preserve">7</w:t>
+            </w:r>
+          </w:p>
+        </w:tc>
+        <w:tc>
+          <w:tcPr>
+            <w:tcW w:type="dxa" w:w="1900"/>
             <w:tcBorders>
               <w:top w:val="single" w:color="B9C6E8" w:sz="6"/>
               <w:left w:val="single" w:color="B9C6E8" w:sz="6"/>
@@ -5411,358 +5217,19 @@
             </w:pPr>
             <w:r>
               <w:rPr>
-                <w:rFonts w:ascii="Calibri" w:cs="Calibri" w:eastAsia="Calibri" w:hAnsi="Calibri"/>
-                <w:b/>
-                <w:bCs/>
-                <w:color w:val="1E2761"/>
-                <w:sz w:val="22"/>
-                <w:szCs w:val="22"/>
-              </w:rPr>
-              <w:t xml:space="preserve">Tom</w:t>
-            </w:r>
-          </w:p>
-        </w:tc>
-        <w:tc>
-          <w:tcPr>
-            <w:tcW w:type="dxa" w:w="6906"/>
-            <w:tcBorders>
-              <w:top w:val="single" w:color="B9C6E8" w:sz="6"/>
-              <w:left w:val="single" w:color="B9C6E8" w:sz="6"/>
-              <w:bottom w:val="single" w:color="B9C6E8" w:sz="6"/>
-              <w:right w:val="single" w:color="B9C6E8" w:sz="6"/>
-            </w:tcBorders>
-            <w:tcMar>
-              <w:top w:type="dxa" w:w="60"/>
-              <w:left w:type="dxa" w:w="100"/>
-              <w:bottom w:type="dxa" w:w="60"/>
-              <w:right w:type="dxa" w:w="100"/>
-            </w:tcMar>
-            <w:vAlign w:val="center"/>
-          </w:tcPr>
-          <w:p>
-            <w:pPr>
-              <w:spacing w:after="0" w:before="0"/>
-            </w:pPr>
-            <w:r>
-              <w:rPr>
                 <w:rFonts w:ascii="Cambria" w:cs="Cambria" w:eastAsia="Cambria" w:hAnsi="Cambria"/>
-                <w:color w:val="000000"/>
-                <w:sz w:val="21"/>
-                <w:szCs w:val="21"/>
-              </w:rPr>
-              <w:t xml:space="preserve">Okay, das ist fair. Tut mir leid.</w:t>
-            </w:r>
-          </w:p>
-        </w:tc>
-        <w:tc>
-          <w:tcPr>
-            <w:tcW w:type="dxa" w:w="1500"/>
-            <w:tcBorders>
-              <w:top w:val="single" w:color="B9C6E8" w:sz="6"/>
-              <w:left w:val="single" w:color="B9C6E8" w:sz="6"/>
-              <w:bottom w:val="single" w:color="B9C6E8" w:sz="6"/>
-              <w:right w:val="single" w:color="B9C6E8" w:sz="6"/>
-            </w:tcBorders>
-            <w:tcMar>
-              <w:top w:type="dxa" w:w="60"/>
-              <w:left w:type="dxa" w:w="100"/>
-              <w:bottom w:type="dxa" w:w="60"/>
-              <w:right w:type="dxa" w:w="100"/>
-            </w:tcMar>
-            <w:vAlign w:val="center"/>
-          </w:tcPr>
-          <w:p>
-            <w:pPr>
-              <w:spacing w:after="0" w:before="0"/>
-              <w:jc w:val="center"/>
-            </w:pPr>
-            <w:r>
-              <w:rPr>
-                <w:rFonts w:ascii="Calibri" w:cs="Calibri" w:eastAsia="Calibri" w:hAnsi="Calibri"/>
-                <w:b/>
-                <w:bCs/>
-                <w:color w:val="2E9E6B"/>
-                <w:sz w:val="18"/>
-                <w:szCs w:val="18"/>
-              </w:rPr>
-              <w:t xml:space="preserve">B Empathie</w:t>
-            </w:r>
-          </w:p>
-        </w:tc>
-      </w:tr>
-      <w:tr>
-        <w:trPr>
-          <w:cantSplit/>
-          <w:trHeight w:val="640" w:hRule="atLeast"/>
-        </w:trPr>
-        <w:tc>
-          <w:tcPr>
-            <w:tcW w:type="dxa" w:w="700"/>
-            <w:tcBorders>
-              <w:top w:val="single" w:color="B9C6E8" w:sz="6"/>
-              <w:left w:val="single" w:color="B9C6E8" w:sz="6"/>
-              <w:bottom w:val="single" w:color="B9C6E8" w:sz="6"/>
-              <w:right w:val="single" w:color="B9C6E8" w:sz="6"/>
-            </w:tcBorders>
-            <w:shd w:fill="F4F7FD" w:color="auto" w:val="clear"/>
-            <w:tcMar>
-              <w:top w:type="dxa" w:w="60"/>
-              <w:left w:type="dxa" w:w="100"/>
-              <w:bottom w:type="dxa" w:w="60"/>
-              <w:right w:type="dxa" w:w="100"/>
-            </w:tcMar>
-            <w:vAlign w:val="center"/>
-          </w:tcPr>
-          <w:p>
-            <w:pPr>
-              <w:spacing w:after="0" w:before="0"/>
-              <w:jc w:val="center"/>
-            </w:pPr>
-            <w:r>
-              <w:rPr>
-                <w:rFonts w:ascii="Calibri" w:cs="Calibri" w:eastAsia="Calibri" w:hAnsi="Calibri"/>
-                <w:b/>
-                <w:bCs/>
-                <w:color w:val="5B6B8C"/>
-                <w:sz w:val="22"/>
-                <w:szCs w:val="22"/>
-              </w:rPr>
-              <w:t xml:space="preserve">7</w:t>
-            </w:r>
-          </w:p>
-        </w:tc>
-        <w:tc>
-          <w:tcPr>
-            <w:tcW w:type="dxa" w:w="1100"/>
-            <w:tcBorders>
-              <w:top w:val="single" w:color="B9C6E8" w:sz="6"/>
-              <w:left w:val="single" w:color="B9C6E8" w:sz="6"/>
-              <w:bottom w:val="single" w:color="B9C6E8" w:sz="6"/>
-              <w:right w:val="single" w:color="B9C6E8" w:sz="6"/>
-            </w:tcBorders>
-            <w:shd w:fill="F4F7FD" w:color="auto" w:val="clear"/>
-            <w:tcMar>
-              <w:top w:type="dxa" w:w="60"/>
-              <w:left w:type="dxa" w:w="100"/>
-              <w:bottom w:type="dxa" w:w="60"/>
-              <w:right w:type="dxa" w:w="100"/>
-            </w:tcMar>
-            <w:vAlign w:val="center"/>
-          </w:tcPr>
-          <w:p>
-            <w:pPr>
-              <w:spacing w:after="0" w:before="0"/>
-            </w:pPr>
-            <w:r>
-              <w:rPr>
-                <w:rFonts w:ascii="Calibri" w:cs="Calibri" w:eastAsia="Calibri" w:hAnsi="Calibri"/>
-                <w:b/>
-                <w:bCs/>
-                <w:color w:val="1E2761"/>
-                <w:sz w:val="22"/>
-                <w:szCs w:val="22"/>
-              </w:rPr>
-              <w:t xml:space="preserve">Lena</w:t>
-            </w:r>
-          </w:p>
-        </w:tc>
-        <w:tc>
-          <w:tcPr>
-            <w:tcW w:type="dxa" w:w="6906"/>
-            <w:tcBorders>
-              <w:top w:val="single" w:color="B9C6E8" w:sz="6"/>
-              <w:left w:val="single" w:color="B9C6E8" w:sz="6"/>
-              <w:bottom w:val="single" w:color="B9C6E8" w:sz="6"/>
-              <w:right w:val="single" w:color="B9C6E8" w:sz="6"/>
-            </w:tcBorders>
-            <w:tcMar>
-              <w:top w:type="dxa" w:w="60"/>
-              <w:left w:type="dxa" w:w="100"/>
-              <w:bottom w:type="dxa" w:w="60"/>
-              <w:right w:type="dxa" w:w="100"/>
-            </w:tcMar>
-            <w:vAlign w:val="center"/>
-          </w:tcPr>
-          <w:p>
-            <w:pPr>
-              <w:spacing w:after="0" w:before="0"/>
-            </w:pPr>
-            <w:r>
-              <w:rPr>
-                <w:rFonts w:ascii="Cambria" w:cs="Cambria" w:eastAsia="Cambria" w:hAnsi="Cambria"/>
-                <w:color w:val="000000"/>
-                <w:sz w:val="21"/>
-                <w:szCs w:val="21"/>
-              </w:rPr>
-              <w:t xml:space="preserve">Kannst du mir die Folien bis 19 Uhr schicken? Dann schaue ich drüber, und wir proben morgen früh vor der ersten Stunde einmal.</w:t>
-            </w:r>
-          </w:p>
-        </w:tc>
-        <w:tc>
-          <w:tcPr>
-            <w:tcW w:type="dxa" w:w="1500"/>
-            <w:tcBorders>
-              <w:top w:val="single" w:color="B9C6E8" w:sz="6"/>
-              <w:left w:val="single" w:color="B9C6E8" w:sz="6"/>
-              <w:bottom w:val="single" w:color="B9C6E8" w:sz="6"/>
-              <w:right w:val="single" w:color="B9C6E8" w:sz="6"/>
-            </w:tcBorders>
-            <w:tcMar>
-              <w:top w:type="dxa" w:w="60"/>
-              <w:left w:type="dxa" w:w="100"/>
-              <w:bottom w:type="dxa" w:w="60"/>
-              <w:right w:type="dxa" w:w="100"/>
-            </w:tcMar>
-            <w:vAlign w:val="center"/>
-          </w:tcPr>
-          <w:p>
-            <w:pPr>
-              <w:spacing w:after="0" w:before="0"/>
-              <w:jc w:val="center"/>
-            </w:pPr>
-            <w:r>
-              <w:rPr>
-                <w:rFonts w:ascii="Calibri" w:cs="Calibri" w:eastAsia="Calibri" w:hAnsi="Calibri"/>
-                <w:b/>
-                <w:bCs/>
-                <w:color w:val="E8A33D"/>
-                <w:sz w:val="18"/>
-                <w:szCs w:val="18"/>
-              </w:rPr>
-              <w:t xml:space="preserve">C Bitte</w:t>
-            </w:r>
-          </w:p>
-        </w:tc>
-      </w:tr>
-      <w:tr>
-        <w:trPr>
-          <w:cantSplit/>
-          <w:trHeight w:val="640" w:hRule="atLeast"/>
-        </w:trPr>
-        <w:tc>
-          <w:tcPr>
-            <w:tcW w:type="dxa" w:w="700"/>
-            <w:tcBorders>
-              <w:top w:val="single" w:color="B9C6E8" w:sz="6"/>
-              <w:left w:val="single" w:color="B9C6E8" w:sz="6"/>
-              <w:bottom w:val="single" w:color="B9C6E8" w:sz="6"/>
-              <w:right w:val="single" w:color="B9C6E8" w:sz="6"/>
-            </w:tcBorders>
-            <w:shd w:fill="F4F7FD" w:color="auto" w:val="clear"/>
-            <w:tcMar>
-              <w:top w:type="dxa" w:w="60"/>
-              <w:left w:type="dxa" w:w="100"/>
-              <w:bottom w:type="dxa" w:w="60"/>
-              <w:right w:type="dxa" w:w="100"/>
-            </w:tcMar>
-            <w:vAlign w:val="center"/>
-          </w:tcPr>
-          <w:p>
-            <w:pPr>
-              <w:spacing w:after="0" w:before="0"/>
-              <w:jc w:val="center"/>
-            </w:pPr>
-            <w:r>
-              <w:rPr>
-                <w:rFonts w:ascii="Calibri" w:cs="Calibri" w:eastAsia="Calibri" w:hAnsi="Calibri"/>
-                <w:b/>
-                <w:bCs/>
-                <w:color w:val="5B6B8C"/>
-                <w:sz w:val="22"/>
-                <w:szCs w:val="22"/>
-              </w:rPr>
-              <w:t xml:space="preserve">8</w:t>
-            </w:r>
-          </w:p>
-        </w:tc>
-        <w:tc>
-          <w:tcPr>
-            <w:tcW w:type="dxa" w:w="1100"/>
-            <w:tcBorders>
-              <w:top w:val="single" w:color="B9C6E8" w:sz="6"/>
-              <w:left w:val="single" w:color="B9C6E8" w:sz="6"/>
-              <w:bottom w:val="single" w:color="B9C6E8" w:sz="6"/>
-              <w:right w:val="single" w:color="B9C6E8" w:sz="6"/>
-            </w:tcBorders>
-            <w:shd w:fill="F4F7FD" w:color="auto" w:val="clear"/>
-            <w:tcMar>
-              <w:top w:type="dxa" w:w="60"/>
-              <w:left w:type="dxa" w:w="100"/>
-              <w:bottom w:type="dxa" w:w="60"/>
-              <w:right w:type="dxa" w:w="100"/>
-            </w:tcMar>
-            <w:vAlign w:val="center"/>
-          </w:tcPr>
-          <w:p>
-            <w:pPr>
-              <w:spacing w:after="0" w:before="0"/>
-            </w:pPr>
-            <w:r>
-              <w:rPr>
-                <w:rFonts w:ascii="Calibri" w:cs="Calibri" w:eastAsia="Calibri" w:hAnsi="Calibri"/>
-                <w:b/>
-                <w:bCs/>
-                <w:color w:val="1E2761"/>
-                <w:sz w:val="22"/>
-                <w:szCs w:val="22"/>
-              </w:rPr>
-              <w:t xml:space="preserve">Tom</w:t>
-            </w:r>
-          </w:p>
-        </w:tc>
-        <w:tc>
-          <w:tcPr>
-            <w:tcW w:type="dxa" w:w="6906"/>
-            <w:tcBorders>
-              <w:top w:val="single" w:color="B9C6E8" w:sz="6"/>
-              <w:left w:val="single" w:color="B9C6E8" w:sz="6"/>
-              <w:bottom w:val="single" w:color="B9C6E8" w:sz="6"/>
-              <w:right w:val="single" w:color="B9C6E8" w:sz="6"/>
-            </w:tcBorders>
-            <w:tcMar>
-              <w:top w:type="dxa" w:w="60"/>
-              <w:left w:type="dxa" w:w="100"/>
-              <w:bottom w:type="dxa" w:w="60"/>
-              <w:right w:type="dxa" w:w="100"/>
-            </w:tcMar>
-            <w:vAlign w:val="center"/>
-          </w:tcPr>
-          <w:p>
-            <w:pPr>
-              <w:spacing w:after="0" w:before="0"/>
-            </w:pPr>
-            <w:r>
-              <w:rPr>
-                <w:rFonts w:ascii="Cambria" w:cs="Cambria" w:eastAsia="Cambria" w:hAnsi="Cambria"/>
-                <w:color w:val="000000"/>
-                <w:sz w:val="21"/>
-                <w:szCs w:val="21"/>
-              </w:rPr>
-              <w:t xml:space="preserve">19 Uhr schaffe ich. Und beim nächsten Mal sagen wir uns früher Bescheid, wenn’s eng wird – einverstanden?</w:t>
-            </w:r>
-          </w:p>
-        </w:tc>
-        <w:tc>
-          <w:tcPr>
-            <w:tcW w:type="dxa" w:w="1500"/>
-            <w:tcBorders>
-              <w:top w:val="single" w:color="B9C6E8" w:sz="6"/>
-              <w:left w:val="single" w:color="B9C6E8" w:sz="6"/>
-              <w:bottom w:val="single" w:color="B9C6E8" w:sz="6"/>
-              <w:right w:val="single" w:color="B9C6E8" w:sz="6"/>
-            </w:tcBorders>
-            <w:tcMar>
-              <w:top w:type="dxa" w:w="60"/>
-              <w:left w:type="dxa" w:w="100"/>
-              <w:bottom w:type="dxa" w:w="60"/>
-              <w:right w:type="dxa" w:w="100"/>
-            </w:tcMar>
-            <w:vAlign w:val="center"/>
-          </w:tcPr>
-          <w:p>
-            <w:pPr>
-              <w:spacing w:after="0" w:before="0"/>
-              <w:jc w:val="center"/>
+                <w:b/>
+                <w:bCs/>
+                <w:color w:val="8E5BB5"/>
+                <w:sz w:val="30"/>
+                <w:szCs w:val="30"/>
+              </w:rPr>
+              <w:t xml:space="preserve">D</w:t>
+            </w:r>
+          </w:p>
+          <w:p>
+            <w:pPr>
+              <w:spacing w:after="0" w:before="0"/>
             </w:pPr>
             <w:r>
               <w:rPr>
@@ -5773,90 +5240,13 @@
                 <w:sz w:val="18"/>
                 <w:szCs w:val="18"/>
               </w:rPr>
-              <w:t xml:space="preserve">D Meta</w:t>
-            </w:r>
-          </w:p>
-        </w:tc>
-      </w:tr>
-      <w:tr>
-        <w:trPr>
-          <w:cantSplit/>
-          <w:trHeight w:val="640" w:hRule="atLeast"/>
-        </w:trPr>
-        <w:tc>
-          <w:tcPr>
-            <w:tcW w:type="dxa" w:w="700"/>
-            <w:tcBorders>
-              <w:top w:val="single" w:color="B9C6E8" w:sz="6"/>
-              <w:left w:val="single" w:color="B9C6E8" w:sz="6"/>
-              <w:bottom w:val="single" w:color="B9C6E8" w:sz="6"/>
-              <w:right w:val="single" w:color="B9C6E8" w:sz="6"/>
-            </w:tcBorders>
-            <w:shd w:fill="F4F7FD" w:color="auto" w:val="clear"/>
-            <w:tcMar>
-              <w:top w:type="dxa" w:w="60"/>
-              <w:left w:type="dxa" w:w="100"/>
-              <w:bottom w:type="dxa" w:w="60"/>
-              <w:right w:type="dxa" w:w="100"/>
-            </w:tcMar>
-            <w:vAlign w:val="center"/>
-          </w:tcPr>
-          <w:p>
-            <w:pPr>
-              <w:spacing w:after="0" w:before="0"/>
-              <w:jc w:val="center"/>
-            </w:pPr>
-            <w:r>
-              <w:rPr>
-                <w:rFonts w:ascii="Calibri" w:cs="Calibri" w:eastAsia="Calibri" w:hAnsi="Calibri"/>
-                <w:b/>
-                <w:bCs/>
-                <w:color w:val="5B6B8C"/>
-                <w:sz w:val="22"/>
-                <w:szCs w:val="22"/>
-              </w:rPr>
-              <w:t xml:space="preserve">9</w:t>
-            </w:r>
-          </w:p>
-        </w:tc>
-        <w:tc>
-          <w:tcPr>
-            <w:tcW w:type="dxa" w:w="1100"/>
-            <w:tcBorders>
-              <w:top w:val="single" w:color="B9C6E8" w:sz="6"/>
-              <w:left w:val="single" w:color="B9C6E8" w:sz="6"/>
-              <w:bottom w:val="single" w:color="B9C6E8" w:sz="6"/>
-              <w:right w:val="single" w:color="B9C6E8" w:sz="6"/>
-            </w:tcBorders>
-            <w:shd w:fill="F4F7FD" w:color="auto" w:val="clear"/>
-            <w:tcMar>
-              <w:top w:type="dxa" w:w="60"/>
-              <w:left w:type="dxa" w:w="100"/>
-              <w:bottom w:type="dxa" w:w="60"/>
-              <w:right w:type="dxa" w:w="100"/>
-            </w:tcMar>
-            <w:vAlign w:val="center"/>
-          </w:tcPr>
-          <w:p>
-            <w:pPr>
-              <w:spacing w:after="0" w:before="0"/>
-            </w:pPr>
-            <w:r>
-              <w:rPr>
-                <w:rFonts w:ascii="Calibri" w:cs="Calibri" w:eastAsia="Calibri" w:hAnsi="Calibri"/>
-                <w:b/>
-                <w:bCs/>
-                <w:color w:val="1E2761"/>
-                <w:sz w:val="22"/>
-                <w:szCs w:val="22"/>
-              </w:rPr>
-              <w:t xml:space="preserve">Lena</w:t>
-            </w:r>
-          </w:p>
-        </w:tc>
-        <w:tc>
-          <w:tcPr>
-            <w:tcW w:type="dxa" w:w="6906"/>
+              <w:t xml:space="preserve">Metakommunikation</w:t>
+            </w:r>
+          </w:p>
+        </w:tc>
+        <w:tc>
+          <w:tcPr>
+            <w:tcW w:type="dxa" w:w="5006"/>
             <w:tcBorders>
               <w:top w:val="single" w:color="B9C6E8" w:sz="6"/>
               <w:left w:val="single" w:color="B9C6E8" w:sz="6"/>
@@ -5879,124 +5269,43 @@
               <w:rPr>
                 <w:rFonts w:ascii="Cambria" w:cs="Cambria" w:eastAsia="Cambria" w:hAnsi="Cambria"/>
                 <w:color w:val="000000"/>
-                <w:sz w:val="21"/>
-                <w:szCs w:val="21"/>
-              </w:rPr>
-              <w:t xml:space="preserve">Einverstanden.</w:t>
-            </w:r>
-          </w:p>
-        </w:tc>
-        <w:tc>
-          <w:tcPr>
-            <w:tcW w:type="dxa" w:w="1500"/>
-            <w:tcBorders>
-              <w:top w:val="single" w:color="B9C6E8" w:sz="6"/>
-              <w:left w:val="single" w:color="B9C6E8" w:sz="6"/>
-              <w:bottom w:val="single" w:color="B9C6E8" w:sz="6"/>
-              <w:right w:val="single" w:color="B9C6E8" w:sz="6"/>
-            </w:tcBorders>
-            <w:tcMar>
-              <w:top w:type="dxa" w:w="60"/>
-              <w:left w:type="dxa" w:w="100"/>
-              <w:bottom w:type="dxa" w:w="60"/>
-              <w:right w:type="dxa" w:w="100"/>
-            </w:tcMar>
-            <w:vAlign w:val="center"/>
-          </w:tcPr>
-          <w:p>
-            <w:pPr>
-              <w:spacing w:after="0" w:before="0"/>
-              <w:jc w:val="center"/>
-            </w:pPr>
-            <w:r>
-              <w:rPr>
-                <w:rFonts w:ascii="Calibri" w:cs="Calibri" w:eastAsia="Calibri" w:hAnsi="Calibri"/>
-                <w:b/>
-                <w:bCs/>
-                <w:color w:val="5B6B8C"/>
+                <w:sz w:val="20"/>
+                <w:szCs w:val="20"/>
+              </w:rPr>
+              <w:t xml:space="preserve">„Moment. Wir werfen uns gerade nur noch Sachen an den Kopf. Eigentlich wollen wir doch beide ein gutes Referat, oder?“</w:t>
+            </w:r>
+          </w:p>
+        </w:tc>
+        <w:tc>
+          <w:tcPr>
+            <w:tcW w:type="dxa" w:w="2400"/>
+            <w:tcBorders>
+              <w:top w:val="single" w:color="B9C6E8" w:sz="6"/>
+              <w:left w:val="single" w:color="B9C6E8" w:sz="6"/>
+              <w:bottom w:val="single" w:color="B9C6E8" w:sz="6"/>
+              <w:right w:val="single" w:color="B9C6E8" w:sz="6"/>
+            </w:tcBorders>
+            <w:shd w:fill="EAF0FA" w:color="auto" w:val="clear"/>
+            <w:tcMar>
+              <w:top w:type="dxa" w:w="60"/>
+              <w:left w:type="dxa" w:w="100"/>
+              <w:bottom w:type="dxa" w:w="60"/>
+              <w:right w:type="dxa" w:w="100"/>
+            </w:tcMar>
+            <w:vAlign w:val="center"/>
+          </w:tcPr>
+          <w:p>
+            <w:pPr>
+              <w:spacing w:after="0" w:before="0"/>
+            </w:pPr>
+            <w:r>
+              <w:rPr>
+                <w:rFonts w:ascii="Calibri" w:cs="Calibri" w:eastAsia="Calibri" w:hAnsi="Calibri"/>
+                <w:color w:val="000000"/>
                 <w:sz w:val="18"/>
                 <w:szCs w:val="18"/>
               </w:rPr>
-              <w:t xml:space="preserve"/>
-            </w:r>
-          </w:p>
-        </w:tc>
-      </w:tr>
-    </w:tbl>
-    <w:p>
-      <w:pPr>
-        <w:spacing w:after="100" w:before="0"/>
-      </w:pPr>
-      <w:r>
-        <w:rPr>
-          <w:rFonts w:ascii="Calibri" w:cs="Calibri" w:eastAsia="Calibri" w:hAnsi="Calibri"/>
-          <w:color w:val="000000"/>
-          <w:sz w:val="22"/>
-          <w:szCs w:val="22"/>
-        </w:rPr>
-        <w:t xml:space="preserve"/>
-      </w:r>
-    </w:p>
-    <w:tbl>
-      <w:tblPr>
-        <w:tblW w:type="dxa" w:w="10206"/>
-        <w:tblBorders>
-          <w:top w:val="single" w:color="auto" w:sz="4"/>
-          <w:left w:val="single" w:color="auto" w:sz="4"/>
-          <w:bottom w:val="single" w:color="auto" w:sz="4"/>
-          <w:right w:val="single" w:color="auto" w:sz="4"/>
-          <w:insideH w:val="single" w:color="auto" w:sz="4"/>
-          <w:insideV w:val="single" w:color="auto" w:sz="4"/>
-        </w:tblBorders>
-      </w:tblPr>
-      <w:tblGrid>
-        <w:gridCol w:w="10206"/>
-      </w:tblGrid>
-      <w:tr>
-        <w:trPr>
-          <w:cantSplit/>
-        </w:trPr>
-        <w:tc>
-          <w:tcPr>
-            <w:tcW w:type="dxa" w:w="10206"/>
-            <w:tcBorders>
-              <w:top w:val="none" w:color="FFFFFF" w:sz="0"/>
-              <w:left w:val="none" w:color="FFFFFF" w:sz="0"/>
-              <w:bottom w:val="none" w:color="FFFFFF" w:sz="0"/>
-              <w:right w:val="none" w:color="FFFFFF" w:sz="0"/>
-            </w:tcBorders>
-            <w:shd w:fill="EAF0FA" w:color="auto" w:val="clear"/>
-            <w:tcMar>
-              <w:top w:type="dxa" w:w="120"/>
-              <w:left w:type="dxa" w:w="100"/>
-              <w:bottom w:type="dxa" w:w="120"/>
-              <w:right w:type="dxa" w:w="100"/>
-            </w:tcMar>
-            <w:vAlign w:val="center"/>
-          </w:tcPr>
-          <w:p>
-            <w:pPr>
-              <w:spacing w:after="40" w:before="0"/>
-            </w:pPr>
-            <w:r>
-              <w:rPr>
-                <w:rFonts w:ascii="Calibri" w:cs="Calibri" w:eastAsia="Calibri" w:hAnsi="Calibri"/>
-                <w:b/>
-                <w:bCs/>
-                <w:color w:val="8E5BB5"/>
-                <w:sz w:val="22"/>
-                <w:szCs w:val="22"/>
-              </w:rPr>
-              <w:t xml:space="preserve">Metakommunikation – wenn es schon eskaliert ist  </w:t>
-            </w:r>
-            <w:r>
-              <w:rPr>
-                <w:rFonts w:ascii="Calibri" w:cs="Calibri" w:eastAsia="Calibri" w:hAnsi="Calibri"/>
-                <w:color w:val="000000"/>
-                <w:sz w:val="20"/>
-                <w:szCs w:val="20"/>
-              </w:rPr>
-              <w:t xml:space="preserve">Auch nach Zeile 7 ist noch etwas zu retten, z. B. Tom: „Stopp. Wir streiten gerade nur noch. Ich will auch, dass das Referat gut wird – lass uns fünf Minuten überlegen, wie wir das bis morgen schaffen.“</w:t>
+              <w:t xml:space="preserve">benennt das Gespräch selbst · kein neuer Vorwurf · gemeinsames Ziel</w:t>
             </w:r>
           </w:p>
         </w:tc>
@@ -6027,7 +5336,32 @@
           <w:sz w:val="26"/>
           <w:szCs w:val="26"/>
         </w:rPr>
-        <w:t xml:space="preserve">Erwartungshorizont Exit-Ticket</w:t>
+        <w:t xml:space="preserve">Erwartungshorizont Mini-Test (Exit-Ticket)</w:t>
+      </w:r>
+    </w:p>
+    <w:p>
+      <w:pPr>
+        <w:spacing w:after="60" w:before="0"/>
+      </w:pPr>
+      <w:r>
+        <w:rPr>
+          <w:rFonts w:ascii="Calibri" w:cs="Calibri" w:eastAsia="Calibri" w:hAnsi="Calibri"/>
+          <w:b/>
+          <w:bCs/>
+          <w:color w:val="000000"/>
+          <w:sz w:val="20"/>
+          <w:szCs w:val="20"/>
+        </w:rPr>
+        <w:t xml:space="preserve">Dialog: </w:t>
+      </w:r>
+      <w:r>
+        <w:rPr>
+          <w:rFonts w:ascii="Calibri" w:cs="Calibri" w:eastAsia="Calibri" w:hAnsi="Calibri"/>
+          <w:color w:val="000000"/>
+          <w:sz w:val="20"/>
+          <w:szCs w:val="20"/>
+        </w:rPr>
+        <w:t xml:space="preserve">Mia fragt, ob sie auf eine Party darf. Zeile 4, Vater: „Du bist doch sowieso immer die Letzte, die nach Hause kommt.“</w:t>
       </w:r>
     </w:p>
     <w:p>
@@ -6052,12 +5386,12 @@
           <w:sz w:val="20"/>
           <w:szCs w:val="20"/>
         </w:rPr>
-        <w:t xml:space="preserve">z. B. „Ich fühle mich gerade übergangen, wenn ich dir etwas erzähle und du dabei aufs Handy schaust. Kannst du es kurz weglegen, bis ich fertig bin?“ – Kriterien: Ich-Form, Gefühl, konkreter Anlass statt „nie“, erfüllbare Bitte.</w:t>
+        <w:t xml:space="preserve">Zeile 4. Du-Botschaft mit Verallgemeinerung („immer“); die Sorge des Vaters (Selbstkundgabe) kommt als Vorwurf an. Mia hört mit dem Beziehungsohr: „Du vertraust mir nicht“ – Zeile 5 ist die Gegenreaktion (symmetrische Eskalation).</w:t>
       </w:r>
     </w:p>
     <w:p>
       <w:pPr>
-        <w:spacing w:after="0" w:before="0"/>
+        <w:spacing w:after="60" w:before="0"/>
       </w:pPr>
       <w:r>
         <w:rPr>
@@ -6077,7 +5411,32 @@
           <w:sz w:val="20"/>
           <w:szCs w:val="20"/>
         </w:rPr>
-        <w:t xml:space="preserve">z. B. Du-Botschaften und Vorwürfe · „immer“ / „nie“ · Gegenangriff statt Antwort · Ironie · es geht um die Person statt um die Sache · Körpersprache (Augenrollen, Wegdrehen, Handy) · lauter werden · Abbruch.</w:t>
+        <w:t xml:space="preserve">z. B. „Ich mache mir Sorgen, wenn du nachts allein unterwegs bist (A). Kannst du mir schreiben, wenn du losfährst, und spätestens um eins zu Hause sein? (C)“ – oder mit Empathie: „Du freust dich total auf die Party, oder? (B) …“</w:t>
+      </w:r>
+    </w:p>
+    <w:p>
+      <w:pPr>
+        <w:spacing w:after="0" w:before="0"/>
+      </w:pPr>
+      <w:r>
+        <w:rPr>
+          <w:rFonts w:ascii="Calibri" w:cs="Calibri" w:eastAsia="Calibri" w:hAnsi="Calibri"/>
+          <w:b/>
+          <w:bCs/>
+          <w:color w:val="1E2761"/>
+          <w:sz w:val="20"/>
+          <w:szCs w:val="20"/>
+        </w:rPr>
+        <w:t xml:space="preserve">Bewertung: </w:t>
+      </w:r>
+      <w:r>
+        <w:rPr>
+          <w:rFonts w:ascii="Calibri" w:cs="Calibri" w:eastAsia="Calibri" w:hAnsi="Calibri"/>
+          <w:color w:val="000000"/>
+          <w:sz w:val="20"/>
+          <w:szCs w:val="20"/>
+        </w:rPr>
+        <w:t xml:space="preserve">Kipppunkt richtig + begründet · zwei Techniken erkennbar und richtig benannt · kein neuer Vorwurf, kein „immer“/„nie“.</w:t>
       </w:r>
     </w:p>
     <w:sectPr>

</xml_diff>

<commit_message>
Deutsch 11: Lösungsfolie nach jeder Technik, neuer Dialog in zwei Rollen zum Abschluss
Co-Authored-By: Claude Opus 5.5 <noreply@anthropic.com>
Claude-Session: https://claude.ai/code/session_01Kzh1oWiqhC6W8oSNq8mKnj
</commit_message>
<xml_diff>
--- a/Deutsch_11/Kommunikationsstoerungen_loesen/Lehrermaterial_und_Loesungen.docx
+++ b/Deutsch_11/Kommunikationsstoerungen_loesen/Lehrermaterial_und_Loesungen.docx
@@ -1575,7 +1575,7 @@
     </w:p>
     <w:p>
       <w:pPr>
-        <w:spacing w:after="100" w:before="0"/>
+        <w:spacing w:after="60" w:before="0"/>
       </w:pPr>
       <w:r>
         <w:rPr>
@@ -1583,8 +1583,8 @@
           <w:i/>
           <w:iCs/>
           <w:color w:val="5B6B8C"/>
-          <w:sz w:val="20"/>
-          <w:szCs w:val="20"/>
+          <w:sz w:val="19"/>
+          <w:szCs w:val="19"/>
         </w:rPr>
         <w:t xml:space="preserve">Minutengenauer Ablauf. Die Folien-Nummern beziehen sich auf die Präsentation.</w:t>
       </w:r>
@@ -1760,7 +1760,7 @@
       <w:tr>
         <w:trPr>
           <w:cantSplit/>
-          <w:trHeight w:val="500" w:hRule="atLeast"/>
+          <w:trHeight w:val="300" w:hRule="atLeast"/>
         </w:trPr>
         <w:tc>
           <w:tcPr>
@@ -1871,8 +1871,8 @@
               <w:rPr>
                 <w:rFonts w:ascii="Calibri" w:cs="Calibri" w:eastAsia="Calibri" w:hAnsi="Calibri"/>
                 <w:color w:val="000000"/>
-                <w:sz w:val="18"/>
-                <w:szCs w:val="18"/>
+                <w:sz w:val="17"/>
+                <w:szCs w:val="17"/>
               </w:rPr>
               <w:t xml:space="preserve">setzt sich wie gewohnt in die Reihen, findet das Arbeitsblatt auf dem Platz</w:t>
             </w:r>
@@ -1904,8 +1904,8 @@
               <w:rPr>
                 <w:rFonts w:ascii="Calibri" w:cs="Calibri" w:eastAsia="Calibri" w:hAnsi="Calibri"/>
                 <w:color w:val="000000"/>
-                <w:sz w:val="18"/>
-                <w:szCs w:val="18"/>
+                <w:sz w:val="17"/>
+                <w:szCs w:val="17"/>
               </w:rPr>
               <w:t xml:space="preserve">Einziger Satz der Einführung: „Heute steht alles auf den Folien – schaut einfach dorthin.“ Folie 2 zeigen, Timer 5 Min. starten.</w:t>
             </w:r>
@@ -1915,7 +1915,7 @@
       <w:tr>
         <w:trPr>
           <w:cantSplit/>
-          <w:trHeight w:val="500" w:hRule="atLeast"/>
+          <w:trHeight w:val="300" w:hRule="atLeast"/>
         </w:trPr>
         <w:tc>
           <w:tcPr>
@@ -2026,8 +2026,8 @@
               <w:rPr>
                 <w:rFonts w:ascii="Calibri" w:cs="Calibri" w:eastAsia="Calibri" w:hAnsi="Calibri"/>
                 <w:color w:val="000000"/>
-                <w:sz w:val="18"/>
-                <w:szCs w:val="18"/>
+                <w:sz w:val="17"/>
+                <w:szCs w:val="17"/>
               </w:rPr>
               <w:t xml:space="preserve">liest M1 still und markiert Kipppunkte mit ↯ (3'), vergleicht dann mit dem Sitznachbarn (2')</w:t>
             </w:r>
@@ -2059,8 +2059,8 @@
               <w:rPr>
                 <w:rFonts w:ascii="Calibri" w:cs="Calibri" w:eastAsia="Calibri" w:hAnsi="Calibri"/>
                 <w:color w:val="000000"/>
-                <w:sz w:val="18"/>
-                <w:szCs w:val="18"/>
+                <w:sz w:val="17"/>
+                <w:szCs w:val="17"/>
               </w:rPr>
               <w:t xml:space="preserve">Nichts sagen. Nach 3 Min. Handzeichen/Gong für den Partnervergleich.</w:t>
             </w:r>
@@ -2070,7 +2070,7 @@
       <w:tr>
         <w:trPr>
           <w:cantSplit/>
-          <w:trHeight w:val="500" w:hRule="atLeast"/>
+          <w:trHeight w:val="300" w:hRule="atLeast"/>
         </w:trPr>
         <w:tc>
           <w:tcPr>
@@ -2181,8 +2181,8 @@
               <w:rPr>
                 <w:rFonts w:ascii="Calibri" w:cs="Calibri" w:eastAsia="Calibri" w:hAnsi="Calibri"/>
                 <w:color w:val="000000"/>
-                <w:sz w:val="18"/>
-                <w:szCs w:val="18"/>
+                <w:sz w:val="17"/>
+                <w:szCs w:val="17"/>
               </w:rPr>
               <w:t xml:space="preserve">Aufgabe 2 zu zweit</w:t>
             </w:r>
@@ -2214,8 +2214,8 @@
               <w:rPr>
                 <w:rFonts w:ascii="Calibri" w:cs="Calibri" w:eastAsia="Calibri" w:hAnsi="Calibri"/>
                 <w:color w:val="000000"/>
-                <w:sz w:val="18"/>
-                <w:szCs w:val="18"/>
+                <w:sz w:val="17"/>
+                <w:szCs w:val="17"/>
               </w:rPr>
               <w:t xml:space="preserve">Folie 3, Timer 8 Min. Herumgehen und zuhören: Welche Paare finden Zeile 3? Die merken Sie sich fürs Gespräch.</w:t>
             </w:r>
@@ -2225,7 +2225,7 @@
       <w:tr>
         <w:trPr>
           <w:cantSplit/>
-          <w:trHeight w:val="500" w:hRule="atLeast"/>
+          <w:trHeight w:val="300" w:hRule="atLeast"/>
         </w:trPr>
         <w:tc>
           <w:tcPr>
@@ -2336,8 +2336,8 @@
               <w:rPr>
                 <w:rFonts w:ascii="Calibri" w:cs="Calibri" w:eastAsia="Calibri" w:hAnsi="Calibri"/>
                 <w:color w:val="000000"/>
-                <w:sz w:val="18"/>
-                <w:szCs w:val="18"/>
+                <w:sz w:val="17"/>
+                <w:szCs w:val="17"/>
               </w:rPr>
               <w:t xml:space="preserve">Paare nennen Zeile + Fachbegriff, ergänzen ihre Tabelle in anderer Farbe</w:t>
             </w:r>
@@ -2369,8 +2369,8 @@
               <w:rPr>
                 <w:rFonts w:ascii="Calibri" w:cs="Calibri" w:eastAsia="Calibri" w:hAnsi="Calibri"/>
                 <w:color w:val="000000"/>
-                <w:sz w:val="18"/>
-                <w:szCs w:val="18"/>
+                <w:sz w:val="17"/>
+                <w:szCs w:val="17"/>
               </w:rPr>
               <w:t xml:space="preserve">Impuls: „In welcher Zeile kippt es zum ersten Mal – und warum?“ Wer geantwortet hat, nimmt die nächste Person dran. Ziel: Zeilen 3, 4, 5, 7 – genau die werden gleich umformuliert. Zum Schluss Folie 4.</w:t>
             </w:r>
@@ -2380,7 +2380,7 @@
       <w:tr>
         <w:trPr>
           <w:cantSplit/>
-          <w:trHeight w:val="500" w:hRule="atLeast"/>
+          <w:trHeight w:val="300" w:hRule="atLeast"/>
         </w:trPr>
         <w:tc>
           <w:tcPr>
@@ -2462,7 +2462,7 @@
                 <w:sz w:val="16"/>
                 <w:szCs w:val="16"/>
               </w:rPr>
-              <w:t xml:space="preserve">Folie 5, dann je 3 Folien pro Technik (6–17)</w:t>
+              <w:t xml:space="preserve">Folie 5, dann je 4 Folien pro Technik (6–21)</w:t>
             </w:r>
           </w:p>
         </w:tc>
@@ -2491,10 +2491,10 @@
               <w:rPr>
                 <w:rFonts w:ascii="Calibri" w:cs="Calibri" w:eastAsia="Calibri" w:hAnsi="Calibri"/>
                 <w:color w:val="000000"/>
-                <w:sz w:val="18"/>
-                <w:szCs w:val="18"/>
-              </w:rPr>
-              <w:t xml:space="preserve">pro Technik (ca. 5,5'): 1 Ansehen – Kontrastpaar besprechen, Formel in die Lücke; 2 ✍ M1 umschreiben – allein (2'): A Z. 3 ab ca. 21', B Z. 4 ab ca. 26', C Z. 5 ab ca. 32', D Z. 7 ab ca. 37'; 3 Prüfen – Daumenprobe</w:t>
+                <w:sz w:val="17"/>
+                <w:szCs w:val="17"/>
+              </w:rPr>
+              <w:t xml:space="preserve">pro Technik (ca. 5,5'): 1 Ansehen – Kontrastpaar besprechen, Formel in die Lücke; 2 ✍ M1 umschreiben – allein (2'): A Z. 3 ab ca. 21', B Z. 4 ab ca. 26', C Z. 5 ab ca. 32', D Z. 7 ab ca. 37'; 3 Prüfen – Daumenprobe, dann mögliche Lösung auf der Folie</w:t>
             </w:r>
           </w:p>
         </w:tc>
@@ -2524,10 +2524,10 @@
               <w:rPr>
                 <w:rFonts w:ascii="Calibri" w:cs="Calibri" w:eastAsia="Calibri" w:hAnsi="Calibri"/>
                 <w:color w:val="000000"/>
-                <w:sz w:val="18"/>
-                <w:szCs w:val="18"/>
-              </w:rPr>
-              <w:t xml:space="preserve">Folie 5 kurz zeigen (Takt). Dann je Technik: Folie 1 Kontrastpaar – Impuls: „Was macht den zweiten Satz besser?“ (1,5'). Folie 2 Formel – Lücke ergänzen (0,5'). Folie 3 „✍ Jetzt du: M1 umschreiben“ – Timer 2 Min., herumgehen. Eine vorher gesehene gute Lösung vorlesen lassen, Klasse zeigt Daumen hoch/runter – bei „runter“ verbessert die Klasse gemeinsam. A (Z. 3) → B (Z. 4) → C (Z. 5) → D (Z. 7).</w:t>
+                <w:sz w:val="17"/>
+                <w:szCs w:val="17"/>
+              </w:rPr>
+              <w:t xml:space="preserve">Folie 5 kurz zeigen (Takt). Dann je Technik: Folie 1 Kontrastpaar – Impuls: „Was macht den zweiten Satz besser?“ (1,5'). Folie 2 Formel – Lücke ergänzen (0,5'). Folie 3 „✍ Jetzt du: M1 umschreiben“ – Timer 2 Min., herumgehen. Eine vorher gesehene gute Lösung vorlesen lassen, Klasse zeigt Daumen hoch/runter – bei „runter“ verbessert die Klasse gemeinsam. Folie 4: mögliche Lösung zeigen (0,5'). A (Z. 3) → B (Z. 4) → C (Z. 5) → D (Z. 7).</w:t>
             </w:r>
           </w:p>
         </w:tc>
@@ -2535,7 +2535,7 @@
       <w:tr>
         <w:trPr>
           <w:cantSplit/>
-          <w:trHeight w:val="500" w:hRule="atLeast"/>
+          <w:trHeight w:val="300" w:hRule="atLeast"/>
         </w:trPr>
         <w:tc>
           <w:tcPr>
@@ -2603,7 +2603,7 @@
                 <w:sz w:val="19"/>
                 <w:szCs w:val="19"/>
               </w:rPr>
-              <w:t xml:space="preserve">Werkzeugkasten</w:t>
+              <w:t xml:space="preserve">Werkzeugkasten + Vorlesen</w:t>
             </w:r>
           </w:p>
           <w:p>
@@ -2617,7 +2617,7 @@
                 <w:sz w:val="16"/>
                 <w:szCs w:val="16"/>
               </w:rPr>
-              <w:t xml:space="preserve">Folie 18 (→ 19)</w:t>
+              <w:t xml:space="preserve">Folie 22 → 23</w:t>
             </w:r>
           </w:p>
         </w:tc>
@@ -2646,10 +2646,10 @@
               <w:rPr>
                 <w:rFonts w:ascii="Calibri" w:cs="Calibri" w:eastAsia="Calibri" w:hAnsi="Calibri"/>
                 <w:color w:val="000000"/>
-                <w:sz w:val="18"/>
-                <w:szCs w:val="18"/>
-              </w:rPr>
-              <w:t xml:space="preserve">vergleicht die eigenen Formeln und Lösungen mit der Übersicht</w:t>
+                <w:sz w:val="17"/>
+                <w:szCs w:val="17"/>
+              </w:rPr>
+              <w:t xml:space="preserve">Überblick über alle vier Techniken; zwei Personen lesen den neuen Dialog als Lena und Tom – mit ihren eigenen Zeilen 3, 4, 5, 7</w:t>
             </w:r>
           </w:p>
         </w:tc>
@@ -2679,10 +2679,10 @@
               <w:rPr>
                 <w:rFonts w:ascii="Calibri" w:cs="Calibri" w:eastAsia="Calibri" w:hAnsi="Calibri"/>
                 <w:color w:val="000000"/>
-                <w:sz w:val="18"/>
-                <w:szCs w:val="18"/>
-              </w:rPr>
-              <w:t xml:space="preserve">Folie 18 als Zusammenfassung zeigen. Folie 19 (ganzer Dialog) nur, wenn Zeit bleibt.</w:t>
+                <w:sz w:val="17"/>
+                <w:szCs w:val="17"/>
+              </w:rPr>
+              <w:t xml:space="preserve">Folie 22 kurz zeigen (30 Sek.). Folie 23: zwei Freiwillige lesen in verteilten Rollen. Optionaler Impuls: „Was hat sich verändert?“ Überleitung zur eigenen Szene.</w:t>
             </w:r>
           </w:p>
         </w:tc>
@@ -2690,7 +2690,7 @@
       <w:tr>
         <w:trPr>
           <w:cantSplit/>
-          <w:trHeight w:val="500" w:hRule="atLeast"/>
+          <w:trHeight w:val="300" w:hRule="atLeast"/>
         </w:trPr>
         <w:tc>
           <w:tcPr>
@@ -2772,7 +2772,7 @@
                 <w:sz w:val="16"/>
                 <w:szCs w:val="16"/>
               </w:rPr>
-              <w:t xml:space="preserve">Folie 20</w:t>
+              <w:t xml:space="preserve">Folie 24</w:t>
             </w:r>
           </w:p>
         </w:tc>
@@ -2801,8 +2801,8 @@
               <w:rPr>
                 <w:rFonts w:ascii="Calibri" w:cs="Calibri" w:eastAsia="Calibri" w:hAnsi="Calibri"/>
                 <w:color w:val="000000"/>
-                <w:sz w:val="18"/>
-                <w:szCs w:val="18"/>
+                <w:sz w:val="17"/>
+                <w:szCs w:val="17"/>
               </w:rPr>
               <w:t xml:space="preserve">Reihen rücken zusammen, öffnen den Umschlag, verteilen Rollen (3'); erfinden eine eigene Situation, verteilen Besetzung A und B, proben in den letzten 5'</w:t>
             </w:r>
@@ -2834,10 +2834,10 @@
               <w:rPr>
                 <w:rFonts w:ascii="Calibri" w:cs="Calibri" w:eastAsia="Calibri" w:hAnsi="Calibri"/>
                 <w:color w:val="000000"/>
-                <w:sz w:val="18"/>
-                <w:szCs w:val="18"/>
-              </w:rPr>
-              <w:t xml:space="preserve">Folie 20, Timer 3 + 16 Min. Nach 5 Min. Runde: Hat jede Gruppe eine Idee? Wenn nicht: erst Tippkarte, dann Notfall-Idee. Um ca. 57': eine Person als Moderation gewinnen und ihr die Moderationskarte geben.</w:t>
+                <w:sz w:val="17"/>
+                <w:szCs w:val="17"/>
+              </w:rPr>
+              <w:t xml:space="preserve">Folie 24, Timer 3 + 16 Min. Nach 5 Min. Runde: Hat jede Gruppe eine Idee? Wenn nicht: erst Tippkarte, dann Notfall-Idee. Um ca. 57': eine Person als Moderation gewinnen und ihr die Moderationskarte geben.</w:t>
             </w:r>
           </w:p>
         </w:tc>
@@ -2845,7 +2845,7 @@
       <w:tr>
         <w:trPr>
           <w:cantSplit/>
-          <w:trHeight w:val="500" w:hRule="atLeast"/>
+          <w:trHeight w:val="300" w:hRule="atLeast"/>
         </w:trPr>
         <w:tc>
           <w:tcPr>
@@ -2927,7 +2927,7 @@
                 <w:sz w:val="16"/>
                 <w:szCs w:val="16"/>
               </w:rPr>
-              <w:t xml:space="preserve">Folie 21</w:t>
+              <w:t xml:space="preserve">Folie 25</w:t>
             </w:r>
           </w:p>
         </w:tc>
@@ -2956,8 +2956,8 @@
               <w:rPr>
                 <w:rFonts w:ascii="Calibri" w:cs="Calibri" w:eastAsia="Calibri" w:hAnsi="Calibri"/>
                 <w:color w:val="000000"/>
-                <w:sz w:val="18"/>
-                <w:szCs w:val="18"/>
+                <w:sz w:val="17"/>
+                <w:szCs w:val="17"/>
               </w:rPr>
               <w:t xml:space="preserve">Wand → Mitte → Fenster spielen je Version A und B ohne Unterbrechung; das Publikum füllt den Beobachtungsbogen aus</w:t>
             </w:r>
@@ -2989,10 +2989,10 @@
               <w:rPr>
                 <w:rFonts w:ascii="Calibri" w:cs="Calibri" w:eastAsia="Calibri" w:hAnsi="Calibri"/>
                 <w:color w:val="000000"/>
-                <w:sz w:val="18"/>
-                <w:szCs w:val="18"/>
-              </w:rPr>
-              <w:t xml:space="preserve">Folie 21. Ins Publikum setzen, die Moderation leitet. Pro Gruppe ca. 4 Min. Gelungene Formulierungen notieren.</w:t>
+                <w:sz w:val="17"/>
+                <w:szCs w:val="17"/>
+              </w:rPr>
+              <w:t xml:space="preserve">Folie 25. Ins Publikum setzen, die Moderation leitet. Pro Gruppe ca. 4 Min. Gelungene Formulierungen notieren.</w:t>
             </w:r>
           </w:p>
         </w:tc>
@@ -3000,7 +3000,7 @@
       <w:tr>
         <w:trPr>
           <w:cantSplit/>
-          <w:trHeight w:val="500" w:hRule="atLeast"/>
+          <w:trHeight w:val="300" w:hRule="atLeast"/>
         </w:trPr>
         <w:tc>
           <w:tcPr>
@@ -3082,7 +3082,7 @@
                 <w:sz w:val="16"/>
                 <w:szCs w:val="16"/>
               </w:rPr>
-              <w:t xml:space="preserve">Folie 22</w:t>
+              <w:t xml:space="preserve">Folie 26</w:t>
             </w:r>
           </w:p>
         </w:tc>
@@ -3111,8 +3111,8 @@
               <w:rPr>
                 <w:rFonts w:ascii="Calibri" w:cs="Calibri" w:eastAsia="Calibri" w:hAnsi="Calibri"/>
                 <w:color w:val="000000"/>
-                <w:sz w:val="18"/>
-                <w:szCs w:val="18"/>
+                <w:sz w:val="17"/>
+                <w:szCs w:val="17"/>
               </w:rPr>
               <w:t xml:space="preserve">2' still Bogen ergänzen → 2' Gruppe bespricht die Patenszene → Plenum: je Gruppe ca. 1,5 Min. Rückmeldung</w:t>
             </w:r>
@@ -3144,10 +3144,10 @@
               <w:rPr>
                 <w:rFonts w:ascii="Calibri" w:cs="Calibri" w:eastAsia="Calibri" w:hAnsi="Calibri"/>
                 <w:color w:val="000000"/>
-                <w:sz w:val="18"/>
-                <w:szCs w:val="18"/>
-              </w:rPr>
-              <w:t xml:space="preserve">Folie 22. Die Moderation führt durch die Schritte (oder Sie übernehmen Schritt 3).</w:t>
+                <w:sz w:val="17"/>
+                <w:szCs w:val="17"/>
+              </w:rPr>
+              <w:t xml:space="preserve">Folie 26. Die Moderation führt durch die Schritte (oder Sie übernehmen Schritt 3).</w:t>
             </w:r>
           </w:p>
         </w:tc>
@@ -3155,7 +3155,7 @@
       <w:tr>
         <w:trPr>
           <w:cantSplit/>
-          <w:trHeight w:val="500" w:hRule="atLeast"/>
+          <w:trHeight w:val="300" w:hRule="atLeast"/>
         </w:trPr>
         <w:tc>
           <w:tcPr>
@@ -3237,7 +3237,7 @@
                 <w:sz w:val="16"/>
                 <w:szCs w:val="16"/>
               </w:rPr>
-              <w:t xml:space="preserve">Folie 23</w:t>
+              <w:t xml:space="preserve">Folie 27</w:t>
             </w:r>
           </w:p>
         </w:tc>
@@ -3266,8 +3266,8 @@
               <w:rPr>
                 <w:rFonts w:ascii="Calibri" w:cs="Calibri" w:eastAsia="Calibri" w:hAnsi="Calibri"/>
                 <w:color w:val="000000"/>
-                <w:sz w:val="18"/>
-                <w:szCs w:val="18"/>
+                <w:sz w:val="17"/>
+                <w:szCs w:val="17"/>
               </w:rPr>
               <w:t xml:space="preserve">bearbeitet allein einen neuen Kurzdialog: Kipppunkt benennen, mit zwei Techniken umschreiben</w:t>
             </w:r>
@@ -3299,10 +3299,10 @@
               <w:rPr>
                 <w:rFonts w:ascii="Calibri" w:cs="Calibri" w:eastAsia="Calibri" w:hAnsi="Calibri"/>
                 <w:color w:val="000000"/>
-                <w:sz w:val="18"/>
-                <w:szCs w:val="18"/>
-              </w:rPr>
-              <w:t xml:space="preserve">Folie 23, Timer 6 Min. Einsammeln an der Tür. Das Format entspricht der Testaufgabe.</w:t>
+                <w:sz w:val="17"/>
+                <w:szCs w:val="17"/>
+              </w:rPr>
+              <w:t xml:space="preserve">Folie 27, Timer 6 Min. Einsammeln an der Tür. Das Format entspricht der Testaufgabe.</w:t>
             </w:r>
           </w:p>
         </w:tc>
@@ -3310,7 +3310,7 @@
       <w:tr>
         <w:trPr>
           <w:cantSplit/>
-          <w:trHeight w:val="500" w:hRule="atLeast"/>
+          <w:trHeight w:val="300" w:hRule="atLeast"/>
         </w:trPr>
         <w:tc>
           <w:tcPr>
@@ -3407,8 +3407,8 @@
               <w:rPr>
                 <w:rFonts w:ascii="Calibri" w:cs="Calibri" w:eastAsia="Calibri" w:hAnsi="Calibri"/>
                 <w:color w:val="000000"/>
-                <w:sz w:val="18"/>
-                <w:szCs w:val="18"/>
+                <w:sz w:val="17"/>
+                <w:szCs w:val="17"/>
               </w:rPr>
               <w:t xml:space="preserve"/>
             </w:r>
@@ -3440,8 +3440,8 @@
               <w:rPr>
                 <w:rFonts w:ascii="Calibri" w:cs="Calibri" w:eastAsia="Calibri" w:hAnsi="Calibri"/>
                 <w:color w:val="000000"/>
-                <w:sz w:val="18"/>
-                <w:szCs w:val="18"/>
+                <w:sz w:val="17"/>
+                <w:szCs w:val="17"/>
               </w:rPr>
               <w:t xml:space="preserve">Mini-Tests sichten (Erwartungshorizont S. 4): Wer kann einen Kipppunkt allein umschreiben? Welche Technik gelingt noch nicht? Daraus die Übung für die nächste Stunde ableiten.</w:t>
             </w:r>

</xml_diff>